<commit_message>
Actualiza a metodologia LiDAR vehicular como principal + Dron backup
</commit_message>
<xml_diff>
--- a/Proyectos/Tampico_SanLuis/CRONOGRAMA.docx
+++ b/Proyectos/Tampico_SanLuis/CRONOGRAMA.docx
@@ -24,33 +24,36 @@
         <w:tblLook w:firstColumn="1" w:firstRow="1" w:lastColumn="0" w:lastRow="0" w:noHBand="0" w:noVBand="1" w:val="04A0"/>
       </w:tblPr>
       <w:tblGrid>
-        <w:gridCol w:w="393"/>
-        <w:gridCol w:w="393"/>
-        <w:gridCol w:w="393"/>
-        <w:gridCol w:w="393"/>
-        <w:gridCol w:w="393"/>
-        <w:gridCol w:w="393"/>
-        <w:gridCol w:w="393"/>
-        <w:gridCol w:w="393"/>
-        <w:gridCol w:w="393"/>
-        <w:gridCol w:w="393"/>
-        <w:gridCol w:w="393"/>
-        <w:gridCol w:w="393"/>
-        <w:gridCol w:w="393"/>
-        <w:gridCol w:w="393"/>
-        <w:gridCol w:w="393"/>
-        <w:gridCol w:w="393"/>
-        <w:gridCol w:w="393"/>
-        <w:gridCol w:w="393"/>
-        <w:gridCol w:w="393"/>
-        <w:gridCol w:w="393"/>
-        <w:gridCol w:w="393"/>
-        <w:gridCol w:w="393"/>
+        <w:gridCol w:w="1728"/>
+        <w:gridCol w:w="1728"/>
+        <w:gridCol w:w="1728"/>
+        <w:gridCol w:w="1728"/>
+        <w:gridCol w:w="1728"/>
       </w:tblGrid>
       <w:tr>
         <w:tc>
           <w:tcPr>
-            <w:tcW w:type="dxa" w:w="393"/>
+            <w:tcW w:type="dxa" w:w="1728"/>
+          </w:tcPr>
+          <w:p>
+            <w:r>
+              <w:t>Dia</w:t>
+            </w:r>
+          </w:p>
+        </w:tc>
+        <w:tc>
+          <w:tcPr>
+            <w:tcW w:type="dxa" w:w="1728"/>
+          </w:tcPr>
+          <w:p>
+            <w:r>
+              <w:t>Fecha</w:t>
+            </w:r>
+          </w:p>
+        </w:tc>
+        <w:tc>
+          <w:tcPr>
+            <w:tcW w:type="dxa" w:w="1728"/>
           </w:tcPr>
           <w:p>
             <w:r>
@@ -60,271 +63,21 @@
         </w:tc>
         <w:tc>
           <w:tcPr>
-            <w:tcW w:type="dxa" w:w="393"/>
+            <w:tcW w:type="dxa" w:w="1728"/>
           </w:tcPr>
           <w:p>
             <w:r>
-              <w:t>Fecha</w:t>
+              <w:t>km</w:t>
             </w:r>
           </w:p>
         </w:tc>
         <w:tc>
           <w:tcPr>
-            <w:tcW w:type="dxa" w:w="393"/>
+            <w:tcW w:type="dxa" w:w="1728"/>
           </w:tcPr>
           <w:p>
             <w:r>
-              <w:rPr>
-                <w:sz w:val="14"/>
-              </w:rPr>
-              <w:t>30/03</w:t>
-            </w:r>
-          </w:p>
-        </w:tc>
-        <w:tc>
-          <w:tcPr>
-            <w:tcW w:type="dxa" w:w="393"/>
-          </w:tcPr>
-          <w:p>
-            <w:r>
-              <w:rPr>
-                <w:sz w:val="14"/>
-              </w:rPr>
-              <w:t>31/03</w:t>
-            </w:r>
-          </w:p>
-        </w:tc>
-        <w:tc>
-          <w:tcPr>
-            <w:tcW w:type="dxa" w:w="393"/>
-          </w:tcPr>
-          <w:p>
-            <w:r>
-              <w:rPr>
-                <w:sz w:val="14"/>
-              </w:rPr>
-              <w:t>01/04</w:t>
-            </w:r>
-          </w:p>
-        </w:tc>
-        <w:tc>
-          <w:tcPr>
-            <w:tcW w:type="dxa" w:w="393"/>
-          </w:tcPr>
-          <w:p>
-            <w:r>
-              <w:rPr>
-                <w:sz w:val="14"/>
-              </w:rPr>
-              <w:t>02/04</w:t>
-            </w:r>
-          </w:p>
-        </w:tc>
-        <w:tc>
-          <w:tcPr>
-            <w:tcW w:type="dxa" w:w="393"/>
-          </w:tcPr>
-          <w:p>
-            <w:r>
-              <w:rPr>
-                <w:sz w:val="14"/>
-              </w:rPr>
-              <w:t>03/04</w:t>
-            </w:r>
-          </w:p>
-        </w:tc>
-        <w:tc>
-          <w:tcPr>
-            <w:tcW w:type="dxa" w:w="393"/>
-          </w:tcPr>
-          <w:p>
-            <w:r>
-              <w:rPr>
-                <w:sz w:val="14"/>
-              </w:rPr>
-              <w:t>04/04</w:t>
-            </w:r>
-          </w:p>
-        </w:tc>
-        <w:tc>
-          <w:tcPr>
-            <w:tcW w:type="dxa" w:w="393"/>
-          </w:tcPr>
-          <w:p>
-            <w:r>
-              <w:rPr>
-                <w:sz w:val="14"/>
-              </w:rPr>
-              <w:t>05/04</w:t>
-            </w:r>
-          </w:p>
-        </w:tc>
-        <w:tc>
-          <w:tcPr>
-            <w:tcW w:type="dxa" w:w="393"/>
-          </w:tcPr>
-          <w:p>
-            <w:r>
-              <w:rPr>
-                <w:sz w:val="14"/>
-              </w:rPr>
-              <w:t>06/04</w:t>
-            </w:r>
-          </w:p>
-        </w:tc>
-        <w:tc>
-          <w:tcPr>
-            <w:tcW w:type="dxa" w:w="393"/>
-          </w:tcPr>
-          <w:p>
-            <w:r>
-              <w:rPr>
-                <w:sz w:val="14"/>
-              </w:rPr>
-              <w:t>07/04</w:t>
-            </w:r>
-          </w:p>
-        </w:tc>
-        <w:tc>
-          <w:tcPr>
-            <w:tcW w:type="dxa" w:w="393"/>
-          </w:tcPr>
-          <w:p>
-            <w:r>
-              <w:rPr>
-                <w:sz w:val="14"/>
-              </w:rPr>
-              <w:t>08/04</w:t>
-            </w:r>
-          </w:p>
-        </w:tc>
-        <w:tc>
-          <w:tcPr>
-            <w:tcW w:type="dxa" w:w="393"/>
-          </w:tcPr>
-          <w:p>
-            <w:r>
-              <w:rPr>
-                <w:sz w:val="14"/>
-              </w:rPr>
-              <w:t>09/04</w:t>
-            </w:r>
-          </w:p>
-        </w:tc>
-        <w:tc>
-          <w:tcPr>
-            <w:tcW w:type="dxa" w:w="393"/>
-          </w:tcPr>
-          <w:p>
-            <w:r>
-              <w:rPr>
-                <w:sz w:val="14"/>
-              </w:rPr>
-              <w:t>10/04</w:t>
-            </w:r>
-          </w:p>
-        </w:tc>
-        <w:tc>
-          <w:tcPr>
-            <w:tcW w:type="dxa" w:w="393"/>
-          </w:tcPr>
-          <w:p>
-            <w:r>
-              <w:rPr>
-                <w:sz w:val="14"/>
-              </w:rPr>
-              <w:t>11/04</w:t>
-            </w:r>
-          </w:p>
-        </w:tc>
-        <w:tc>
-          <w:tcPr>
-            <w:tcW w:type="dxa" w:w="393"/>
-          </w:tcPr>
-          <w:p>
-            <w:r>
-              <w:rPr>
-                <w:sz w:val="14"/>
-              </w:rPr>
-              <w:t>12/04</w:t>
-            </w:r>
-          </w:p>
-        </w:tc>
-        <w:tc>
-          <w:tcPr>
-            <w:tcW w:type="dxa" w:w="393"/>
-          </w:tcPr>
-          <w:p>
-            <w:r>
-              <w:rPr>
-                <w:sz w:val="14"/>
-              </w:rPr>
-              <w:t>13/04</w:t>
-            </w:r>
-          </w:p>
-        </w:tc>
-        <w:tc>
-          <w:tcPr>
-            <w:tcW w:type="dxa" w:w="393"/>
-          </w:tcPr>
-          <w:p>
-            <w:r>
-              <w:rPr>
-                <w:sz w:val="14"/>
-              </w:rPr>
-              <w:t>14/04</w:t>
-            </w:r>
-          </w:p>
-        </w:tc>
-        <w:tc>
-          <w:tcPr>
-            <w:tcW w:type="dxa" w:w="393"/>
-          </w:tcPr>
-          <w:p>
-            <w:r>
-              <w:rPr>
-                <w:sz w:val="14"/>
-              </w:rPr>
-              <w:t>15/04</w:t>
-            </w:r>
-          </w:p>
-        </w:tc>
-        <w:tc>
-          <w:tcPr>
-            <w:tcW w:type="dxa" w:w="393"/>
-          </w:tcPr>
-          <w:p>
-            <w:r>
-              <w:rPr>
-                <w:sz w:val="14"/>
-              </w:rPr>
-              <w:t>16/04</w:t>
-            </w:r>
-          </w:p>
-        </w:tc>
-        <w:tc>
-          <w:tcPr>
-            <w:tcW w:type="dxa" w:w="393"/>
-          </w:tcPr>
-          <w:p>
-            <w:r>
-              <w:rPr>
-                <w:sz w:val="14"/>
-              </w:rPr>
-              <w:t>17/04</w:t>
-            </w:r>
-          </w:p>
-        </w:tc>
-        <w:tc>
-          <w:tcPr>
-            <w:tcW w:type="dxa" w:w="393"/>
-          </w:tcPr>
-          <w:p>
-            <w:r>
-              <w:rPr>
-                <w:sz w:val="14"/>
-              </w:rPr>
-              <w:t>18/04</w:t>
+              <w:t>Metodo</w:t>
             </w:r>
           </w:p>
         </w:tc>
@@ -332,3177 +85,1060 @@
       <w:tr>
         <w:tc>
           <w:tcPr>
-            <w:tcW w:type="dxa" w:w="393"/>
+            <w:tcW w:type="dxa" w:w="1728"/>
           </w:tcPr>
           <w:p>
             <w:r>
-              <w:t>Bloque 1: Vuelo</w:t>
+              <w:t>1</w:t>
             </w:r>
           </w:p>
         </w:tc>
         <w:tc>
           <w:tcPr>
-            <w:tcW w:type="dxa" w:w="393"/>
+            <w:tcW w:type="dxa" w:w="1728"/>
           </w:tcPr>
           <w:p>
             <w:r>
-              <w:t>30/03</w:t>
+              <w:t>30/03/2026</w:t>
             </w:r>
           </w:p>
         </w:tc>
         <w:tc>
           <w:tcPr>
-            <w:tcW w:type="dxa" w:w="393"/>
-            <w:shd w:fill="D9E2F3"/>
+            <w:tcW w:type="dxa" w:w="1728"/>
           </w:tcPr>
           <w:p>
-            <w:r/>
+            <w:r>
+              <w:t>Bloque 1.0: LiDAR</w:t>
+            </w:r>
           </w:p>
         </w:tc>
         <w:tc>
           <w:tcPr>
-            <w:tcW w:type="dxa" w:w="393"/>
-            <w:shd w:fill="D9E2F3"/>
+            <w:tcW w:type="dxa" w:w="1728"/>
           </w:tcPr>
           <w:p>
-            <w:r/>
+            <w:r>
+              <w:t>50</w:t>
+            </w:r>
           </w:p>
         </w:tc>
         <w:tc>
           <w:tcPr>
-            <w:tcW w:type="dxa" w:w="393"/>
+            <w:tcW w:type="dxa" w:w="1728"/>
             <w:shd w:fill="D9E2F3"/>
           </w:tcPr>
           <w:p>
-            <w:r/>
-          </w:p>
-        </w:tc>
-        <w:tc>
-          <w:tcPr>
-            <w:tcW w:type="dxa" w:w="393"/>
-            <w:shd w:fill="D9E2F3"/>
-          </w:tcPr>
-          <w:p>
-            <w:r/>
-          </w:p>
-        </w:tc>
-        <w:tc>
-          <w:tcPr>
-            <w:tcW w:type="dxa" w:w="393"/>
-            <w:shd w:fill="D9E2F3"/>
-          </w:tcPr>
-          <w:p>
-            <w:r/>
-          </w:p>
-        </w:tc>
-        <w:tc>
-          <w:tcPr>
-            <w:tcW w:type="dxa" w:w="393"/>
-            <w:shd w:fill="D9E2F3"/>
-          </w:tcPr>
-          <w:p>
-            <w:r/>
-          </w:p>
-        </w:tc>
-        <w:tc>
-          <w:tcPr>
-            <w:tcW w:type="dxa" w:w="393"/>
-            <w:shd w:fill="D9E2F3"/>
-          </w:tcPr>
-          <w:p>
-            <w:r/>
-          </w:p>
-        </w:tc>
-        <w:tc>
-          <w:tcPr>
-            <w:tcW w:type="dxa" w:w="393"/>
-            <w:shd w:fill="D9E2F3"/>
-          </w:tcPr>
-          <w:p>
-            <w:r/>
-          </w:p>
-        </w:tc>
-        <w:tc>
-          <w:tcPr>
-            <w:tcW w:type="dxa" w:w="393"/>
-            <w:shd w:fill="D9E2F3"/>
-          </w:tcPr>
-          <w:p>
-            <w:r/>
-          </w:p>
-        </w:tc>
-        <w:tc>
-          <w:tcPr>
-            <w:tcW w:type="dxa" w:w="393"/>
-            <w:shd w:fill="D9E2F3"/>
-          </w:tcPr>
-          <w:p>
-            <w:r/>
-          </w:p>
-        </w:tc>
-        <w:tc>
-          <w:tcPr>
-            <w:tcW w:type="dxa" w:w="393"/>
-            <w:shd w:fill="D9E2F3"/>
-          </w:tcPr>
-          <w:p>
-            <w:r/>
-          </w:p>
-        </w:tc>
-        <w:tc>
-          <w:tcPr>
-            <w:tcW w:type="dxa" w:w="393"/>
-            <w:shd w:fill="D9E2F3"/>
-          </w:tcPr>
-          <w:p>
-            <w:r/>
-          </w:p>
-        </w:tc>
-        <w:tc>
-          <w:tcPr>
-            <w:tcW w:type="dxa" w:w="393"/>
-            <w:shd w:fill="D9E2F3"/>
-          </w:tcPr>
-          <w:p>
-            <w:r/>
-          </w:p>
-        </w:tc>
-        <w:tc>
-          <w:tcPr>
-            <w:tcW w:type="dxa" w:w="393"/>
-            <w:shd w:fill="D9E2F3"/>
-          </w:tcPr>
-          <w:p>
-            <w:r/>
-          </w:p>
-        </w:tc>
-        <w:tc>
-          <w:tcPr>
-            <w:tcW w:type="dxa" w:w="393"/>
-            <w:shd w:fill="D9E2F3"/>
-          </w:tcPr>
-          <w:p>
-            <w:r/>
-          </w:p>
-        </w:tc>
-        <w:tc>
-          <w:tcPr>
-            <w:tcW w:type="dxa" w:w="393"/>
-            <w:shd w:fill="D9E2F3"/>
-          </w:tcPr>
-          <w:p>
-            <w:r/>
-          </w:p>
-        </w:tc>
-        <w:tc>
-          <w:tcPr>
-            <w:tcW w:type="dxa" w:w="393"/>
-            <w:shd w:fill="D9E2F3"/>
-          </w:tcPr>
-          <w:p>
-            <w:r/>
-          </w:p>
-        </w:tc>
-        <w:tc>
-          <w:tcPr>
-            <w:tcW w:type="dxa" w:w="393"/>
-            <w:shd w:fill="D9E2F3"/>
-          </w:tcPr>
-          <w:p>
-            <w:r/>
-          </w:p>
-        </w:tc>
-        <w:tc>
-          <w:tcPr>
-            <w:tcW w:type="dxa" w:w="393"/>
-            <w:shd w:fill="D9E2F3"/>
-          </w:tcPr>
-          <w:p>
-            <w:r/>
-          </w:p>
-        </w:tc>
-        <w:tc>
-          <w:tcPr>
-            <w:tcW w:type="dxa" w:w="393"/>
-            <w:shd w:fill="D9E2F3"/>
-          </w:tcPr>
-          <w:p>
-            <w:r/>
+            <w:r>
+              <w:t>Carro</w:t>
+            </w:r>
           </w:p>
         </w:tc>
       </w:tr>
       <w:tr>
         <w:tc>
           <w:tcPr>
-            <w:tcW w:type="dxa" w:w="393"/>
+            <w:tcW w:type="dxa" w:w="1728"/>
           </w:tcPr>
           <w:p>
             <w:r>
-              <w:t>Bloque 1: Proceso</w:t>
+              <w:t>2</w:t>
             </w:r>
           </w:p>
         </w:tc>
         <w:tc>
           <w:tcPr>
-            <w:tcW w:type="dxa" w:w="393"/>
+            <w:tcW w:type="dxa" w:w="1728"/>
           </w:tcPr>
           <w:p>
             <w:r>
-              <w:t>31/03</w:t>
+              <w:t>31/03/2026</w:t>
             </w:r>
           </w:p>
         </w:tc>
         <w:tc>
           <w:tcPr>
-            <w:tcW w:type="dxa" w:w="393"/>
-          </w:tcPr>
-          <w:p/>
-        </w:tc>
-        <w:tc>
-          <w:tcPr>
-            <w:tcW w:type="dxa" w:w="393"/>
-            <w:shd w:fill="E2EFDA"/>
+            <w:tcW w:type="dxa" w:w="1728"/>
           </w:tcPr>
           <w:p>
-            <w:r/>
+            <w:r>
+              <w:t>Bloque 1.0: Proceso</w:t>
+            </w:r>
           </w:p>
         </w:tc>
         <w:tc>
           <w:tcPr>
-            <w:tcW w:type="dxa" w:w="393"/>
-            <w:shd w:fill="E2EFDA"/>
+            <w:tcW w:type="dxa" w:w="1728"/>
           </w:tcPr>
           <w:p>
-            <w:r/>
+            <w:r>
+              <w:t>-</w:t>
+            </w:r>
           </w:p>
         </w:tc>
         <w:tc>
           <w:tcPr>
-            <w:tcW w:type="dxa" w:w="393"/>
+            <w:tcW w:type="dxa" w:w="1728"/>
             <w:shd w:fill="E2EFDA"/>
           </w:tcPr>
           <w:p>
-            <w:r/>
-          </w:p>
-        </w:tc>
-        <w:tc>
-          <w:tcPr>
-            <w:tcW w:type="dxa" w:w="393"/>
-            <w:shd w:fill="E2EFDA"/>
-          </w:tcPr>
-          <w:p>
-            <w:r/>
-          </w:p>
-        </w:tc>
-        <w:tc>
-          <w:tcPr>
-            <w:tcW w:type="dxa" w:w="393"/>
-            <w:shd w:fill="E2EFDA"/>
-          </w:tcPr>
-          <w:p>
-            <w:r/>
-          </w:p>
-        </w:tc>
-        <w:tc>
-          <w:tcPr>
-            <w:tcW w:type="dxa" w:w="393"/>
-            <w:shd w:fill="E2EFDA"/>
-          </w:tcPr>
-          <w:p>
-            <w:r/>
-          </w:p>
-        </w:tc>
-        <w:tc>
-          <w:tcPr>
-            <w:tcW w:type="dxa" w:w="393"/>
-            <w:shd w:fill="E2EFDA"/>
-          </w:tcPr>
-          <w:p>
-            <w:r/>
-          </w:p>
-        </w:tc>
-        <w:tc>
-          <w:tcPr>
-            <w:tcW w:type="dxa" w:w="393"/>
-            <w:shd w:fill="E2EFDA"/>
-          </w:tcPr>
-          <w:p>
-            <w:r/>
-          </w:p>
-        </w:tc>
-        <w:tc>
-          <w:tcPr>
-            <w:tcW w:type="dxa" w:w="393"/>
-            <w:shd w:fill="E2EFDA"/>
-          </w:tcPr>
-          <w:p>
-            <w:r/>
-          </w:p>
-        </w:tc>
-        <w:tc>
-          <w:tcPr>
-            <w:tcW w:type="dxa" w:w="393"/>
-            <w:shd w:fill="E2EFDA"/>
-          </w:tcPr>
-          <w:p>
-            <w:r/>
-          </w:p>
-        </w:tc>
-        <w:tc>
-          <w:tcPr>
-            <w:tcW w:type="dxa" w:w="393"/>
-            <w:shd w:fill="E2EFDA"/>
-          </w:tcPr>
-          <w:p>
-            <w:r/>
-          </w:p>
-        </w:tc>
-        <w:tc>
-          <w:tcPr>
-            <w:tcW w:type="dxa" w:w="393"/>
-            <w:shd w:fill="E2EFDA"/>
-          </w:tcPr>
-          <w:p>
-            <w:r/>
-          </w:p>
-        </w:tc>
-        <w:tc>
-          <w:tcPr>
-            <w:tcW w:type="dxa" w:w="393"/>
-            <w:shd w:fill="E2EFDA"/>
-          </w:tcPr>
-          <w:p>
-            <w:r/>
-          </w:p>
-        </w:tc>
-        <w:tc>
-          <w:tcPr>
-            <w:tcW w:type="dxa" w:w="393"/>
-            <w:shd w:fill="E2EFDA"/>
-          </w:tcPr>
-          <w:p>
-            <w:r/>
-          </w:p>
-        </w:tc>
-        <w:tc>
-          <w:tcPr>
-            <w:tcW w:type="dxa" w:w="393"/>
-            <w:shd w:fill="E2EFDA"/>
-          </w:tcPr>
-          <w:p>
-            <w:r/>
-          </w:p>
-        </w:tc>
-        <w:tc>
-          <w:tcPr>
-            <w:tcW w:type="dxa" w:w="393"/>
-            <w:shd w:fill="E2EFDA"/>
-          </w:tcPr>
-          <w:p>
-            <w:r/>
-          </w:p>
-        </w:tc>
-        <w:tc>
-          <w:tcPr>
-            <w:tcW w:type="dxa" w:w="393"/>
-            <w:shd w:fill="E2EFDA"/>
-          </w:tcPr>
-          <w:p>
-            <w:r/>
-          </w:p>
-        </w:tc>
-        <w:tc>
-          <w:tcPr>
-            <w:tcW w:type="dxa" w:w="393"/>
-            <w:shd w:fill="E2EFDA"/>
-          </w:tcPr>
-          <w:p>
-            <w:r/>
-          </w:p>
-        </w:tc>
-        <w:tc>
-          <w:tcPr>
-            <w:tcW w:type="dxa" w:w="393"/>
-            <w:shd w:fill="E2EFDA"/>
-          </w:tcPr>
-          <w:p>
-            <w:r/>
+            <w:r>
+              <w:t>Oficina/Dron</w:t>
+            </w:r>
           </w:p>
         </w:tc>
       </w:tr>
       <w:tr>
         <w:tc>
           <w:tcPr>
-            <w:tcW w:type="dxa" w:w="393"/>
+            <w:tcW w:type="dxa" w:w="1728"/>
           </w:tcPr>
           <w:p>
             <w:r>
-              <w:t>Bloque 2: Vuelo</w:t>
+              <w:t>3</w:t>
             </w:r>
           </w:p>
         </w:tc>
         <w:tc>
           <w:tcPr>
-            <w:tcW w:type="dxa" w:w="393"/>
+            <w:tcW w:type="dxa" w:w="1728"/>
           </w:tcPr>
           <w:p>
             <w:r>
-              <w:t>01/04</w:t>
+              <w:t>01/04/2026</w:t>
             </w:r>
           </w:p>
         </w:tc>
         <w:tc>
           <w:tcPr>
-            <w:tcW w:type="dxa" w:w="393"/>
-          </w:tcPr>
-          <w:p/>
-        </w:tc>
-        <w:tc>
-          <w:tcPr>
-            <w:tcW w:type="dxa" w:w="393"/>
-          </w:tcPr>
-          <w:p/>
-        </w:tc>
-        <w:tc>
-          <w:tcPr>
-            <w:tcW w:type="dxa" w:w="393"/>
-            <w:shd w:fill="D9E2F3"/>
+            <w:tcW w:type="dxa" w:w="1728"/>
           </w:tcPr>
           <w:p>
-            <w:r/>
+            <w:r>
+              <w:t>Bloque 2.0: LiDAR</w:t>
+            </w:r>
           </w:p>
         </w:tc>
         <w:tc>
           <w:tcPr>
-            <w:tcW w:type="dxa" w:w="393"/>
-            <w:shd w:fill="D9E2F3"/>
+            <w:tcW w:type="dxa" w:w="1728"/>
           </w:tcPr>
           <w:p>
-            <w:r/>
+            <w:r>
+              <w:t>50</w:t>
+            </w:r>
           </w:p>
         </w:tc>
         <w:tc>
           <w:tcPr>
-            <w:tcW w:type="dxa" w:w="393"/>
+            <w:tcW w:type="dxa" w:w="1728"/>
             <w:shd w:fill="D9E2F3"/>
           </w:tcPr>
           <w:p>
-            <w:r/>
-          </w:p>
-        </w:tc>
-        <w:tc>
-          <w:tcPr>
-            <w:tcW w:type="dxa" w:w="393"/>
-            <w:shd w:fill="D9E2F3"/>
-          </w:tcPr>
-          <w:p>
-            <w:r/>
-          </w:p>
-        </w:tc>
-        <w:tc>
-          <w:tcPr>
-            <w:tcW w:type="dxa" w:w="393"/>
-            <w:shd w:fill="D9E2F3"/>
-          </w:tcPr>
-          <w:p>
-            <w:r/>
-          </w:p>
-        </w:tc>
-        <w:tc>
-          <w:tcPr>
-            <w:tcW w:type="dxa" w:w="393"/>
-            <w:shd w:fill="D9E2F3"/>
-          </w:tcPr>
-          <w:p>
-            <w:r/>
-          </w:p>
-        </w:tc>
-        <w:tc>
-          <w:tcPr>
-            <w:tcW w:type="dxa" w:w="393"/>
-            <w:shd w:fill="D9E2F3"/>
-          </w:tcPr>
-          <w:p>
-            <w:r/>
-          </w:p>
-        </w:tc>
-        <w:tc>
-          <w:tcPr>
-            <w:tcW w:type="dxa" w:w="393"/>
-            <w:shd w:fill="D9E2F3"/>
-          </w:tcPr>
-          <w:p>
-            <w:r/>
-          </w:p>
-        </w:tc>
-        <w:tc>
-          <w:tcPr>
-            <w:tcW w:type="dxa" w:w="393"/>
-            <w:shd w:fill="D9E2F3"/>
-          </w:tcPr>
-          <w:p>
-            <w:r/>
-          </w:p>
-        </w:tc>
-        <w:tc>
-          <w:tcPr>
-            <w:tcW w:type="dxa" w:w="393"/>
-            <w:shd w:fill="D9E2F3"/>
-          </w:tcPr>
-          <w:p>
-            <w:r/>
-          </w:p>
-        </w:tc>
-        <w:tc>
-          <w:tcPr>
-            <w:tcW w:type="dxa" w:w="393"/>
-            <w:shd w:fill="D9E2F3"/>
-          </w:tcPr>
-          <w:p>
-            <w:r/>
-          </w:p>
-        </w:tc>
-        <w:tc>
-          <w:tcPr>
-            <w:tcW w:type="dxa" w:w="393"/>
-            <w:shd w:fill="D9E2F3"/>
-          </w:tcPr>
-          <w:p>
-            <w:r/>
-          </w:p>
-        </w:tc>
-        <w:tc>
-          <w:tcPr>
-            <w:tcW w:type="dxa" w:w="393"/>
-            <w:shd w:fill="D9E2F3"/>
-          </w:tcPr>
-          <w:p>
-            <w:r/>
-          </w:p>
-        </w:tc>
-        <w:tc>
-          <w:tcPr>
-            <w:tcW w:type="dxa" w:w="393"/>
-            <w:shd w:fill="D9E2F3"/>
-          </w:tcPr>
-          <w:p>
-            <w:r/>
-          </w:p>
-        </w:tc>
-        <w:tc>
-          <w:tcPr>
-            <w:tcW w:type="dxa" w:w="393"/>
-            <w:shd w:fill="D9E2F3"/>
-          </w:tcPr>
-          <w:p>
-            <w:r/>
-          </w:p>
-        </w:tc>
-        <w:tc>
-          <w:tcPr>
-            <w:tcW w:type="dxa" w:w="393"/>
-            <w:shd w:fill="D9E2F3"/>
-          </w:tcPr>
-          <w:p>
-            <w:r/>
-          </w:p>
-        </w:tc>
-        <w:tc>
-          <w:tcPr>
-            <w:tcW w:type="dxa" w:w="393"/>
-            <w:shd w:fill="D9E2F3"/>
-          </w:tcPr>
-          <w:p>
-            <w:r/>
-          </w:p>
-        </w:tc>
-        <w:tc>
-          <w:tcPr>
-            <w:tcW w:type="dxa" w:w="393"/>
-            <w:shd w:fill="D9E2F3"/>
-          </w:tcPr>
-          <w:p>
-            <w:r/>
+            <w:r>
+              <w:t>Carro</w:t>
+            </w:r>
           </w:p>
         </w:tc>
       </w:tr>
       <w:tr>
         <w:tc>
           <w:tcPr>
-            <w:tcW w:type="dxa" w:w="393"/>
+            <w:tcW w:type="dxa" w:w="1728"/>
           </w:tcPr>
           <w:p>
             <w:r>
-              <w:t>Bloque 2: Proceso</w:t>
+              <w:t>4</w:t>
             </w:r>
           </w:p>
         </w:tc>
         <w:tc>
           <w:tcPr>
-            <w:tcW w:type="dxa" w:w="393"/>
+            <w:tcW w:type="dxa" w:w="1728"/>
           </w:tcPr>
           <w:p>
             <w:r>
-              <w:t>02/04</w:t>
+              <w:t>02/04/2026</w:t>
             </w:r>
           </w:p>
         </w:tc>
         <w:tc>
           <w:tcPr>
-            <w:tcW w:type="dxa" w:w="393"/>
-          </w:tcPr>
-          <w:p/>
-        </w:tc>
-        <w:tc>
-          <w:tcPr>
-            <w:tcW w:type="dxa" w:w="393"/>
-          </w:tcPr>
-          <w:p/>
-        </w:tc>
-        <w:tc>
-          <w:tcPr>
-            <w:tcW w:type="dxa" w:w="393"/>
-          </w:tcPr>
-          <w:p/>
-        </w:tc>
-        <w:tc>
-          <w:tcPr>
-            <w:tcW w:type="dxa" w:w="393"/>
-            <w:shd w:fill="E2EFDA"/>
+            <w:tcW w:type="dxa" w:w="1728"/>
           </w:tcPr>
           <w:p>
-            <w:r/>
+            <w:r>
+              <w:t>Bloque 2.0: Proceso</w:t>
+            </w:r>
           </w:p>
         </w:tc>
         <w:tc>
           <w:tcPr>
-            <w:tcW w:type="dxa" w:w="393"/>
-            <w:shd w:fill="E2EFDA"/>
+            <w:tcW w:type="dxa" w:w="1728"/>
           </w:tcPr>
           <w:p>
-            <w:r/>
+            <w:r>
+              <w:t>-</w:t>
+            </w:r>
           </w:p>
         </w:tc>
         <w:tc>
           <w:tcPr>
-            <w:tcW w:type="dxa" w:w="393"/>
+            <w:tcW w:type="dxa" w:w="1728"/>
             <w:shd w:fill="E2EFDA"/>
           </w:tcPr>
           <w:p>
-            <w:r/>
-          </w:p>
-        </w:tc>
-        <w:tc>
-          <w:tcPr>
-            <w:tcW w:type="dxa" w:w="393"/>
-            <w:shd w:fill="E2EFDA"/>
-          </w:tcPr>
-          <w:p>
-            <w:r/>
-          </w:p>
-        </w:tc>
-        <w:tc>
-          <w:tcPr>
-            <w:tcW w:type="dxa" w:w="393"/>
-            <w:shd w:fill="E2EFDA"/>
-          </w:tcPr>
-          <w:p>
-            <w:r/>
-          </w:p>
-        </w:tc>
-        <w:tc>
-          <w:tcPr>
-            <w:tcW w:type="dxa" w:w="393"/>
-            <w:shd w:fill="E2EFDA"/>
-          </w:tcPr>
-          <w:p>
-            <w:r/>
-          </w:p>
-        </w:tc>
-        <w:tc>
-          <w:tcPr>
-            <w:tcW w:type="dxa" w:w="393"/>
-            <w:shd w:fill="E2EFDA"/>
-          </w:tcPr>
-          <w:p>
-            <w:r/>
-          </w:p>
-        </w:tc>
-        <w:tc>
-          <w:tcPr>
-            <w:tcW w:type="dxa" w:w="393"/>
-            <w:shd w:fill="E2EFDA"/>
-          </w:tcPr>
-          <w:p>
-            <w:r/>
-          </w:p>
-        </w:tc>
-        <w:tc>
-          <w:tcPr>
-            <w:tcW w:type="dxa" w:w="393"/>
-            <w:shd w:fill="E2EFDA"/>
-          </w:tcPr>
-          <w:p>
-            <w:r/>
-          </w:p>
-        </w:tc>
-        <w:tc>
-          <w:tcPr>
-            <w:tcW w:type="dxa" w:w="393"/>
-            <w:shd w:fill="E2EFDA"/>
-          </w:tcPr>
-          <w:p>
-            <w:r/>
-          </w:p>
-        </w:tc>
-        <w:tc>
-          <w:tcPr>
-            <w:tcW w:type="dxa" w:w="393"/>
-            <w:shd w:fill="E2EFDA"/>
-          </w:tcPr>
-          <w:p>
-            <w:r/>
-          </w:p>
-        </w:tc>
-        <w:tc>
-          <w:tcPr>
-            <w:tcW w:type="dxa" w:w="393"/>
-            <w:shd w:fill="E2EFDA"/>
-          </w:tcPr>
-          <w:p>
-            <w:r/>
-          </w:p>
-        </w:tc>
-        <w:tc>
-          <w:tcPr>
-            <w:tcW w:type="dxa" w:w="393"/>
-            <w:shd w:fill="E2EFDA"/>
-          </w:tcPr>
-          <w:p>
-            <w:r/>
-          </w:p>
-        </w:tc>
-        <w:tc>
-          <w:tcPr>
-            <w:tcW w:type="dxa" w:w="393"/>
-            <w:shd w:fill="E2EFDA"/>
-          </w:tcPr>
-          <w:p>
-            <w:r/>
-          </w:p>
-        </w:tc>
-        <w:tc>
-          <w:tcPr>
-            <w:tcW w:type="dxa" w:w="393"/>
-            <w:shd w:fill="E2EFDA"/>
-          </w:tcPr>
-          <w:p>
-            <w:r/>
-          </w:p>
-        </w:tc>
-        <w:tc>
-          <w:tcPr>
-            <w:tcW w:type="dxa" w:w="393"/>
-            <w:shd w:fill="E2EFDA"/>
-          </w:tcPr>
-          <w:p>
-            <w:r/>
-          </w:p>
-        </w:tc>
-        <w:tc>
-          <w:tcPr>
-            <w:tcW w:type="dxa" w:w="393"/>
-            <w:shd w:fill="E2EFDA"/>
-          </w:tcPr>
-          <w:p>
-            <w:r/>
+            <w:r>
+              <w:t>Oficina/Dron</w:t>
+            </w:r>
           </w:p>
         </w:tc>
       </w:tr>
       <w:tr>
         <w:tc>
           <w:tcPr>
-            <w:tcW w:type="dxa" w:w="393"/>
+            <w:tcW w:type="dxa" w:w="1728"/>
           </w:tcPr>
           <w:p>
             <w:r>
-              <w:t>Bloque 3: Vuelo</w:t>
+              <w:t>5</w:t>
             </w:r>
           </w:p>
         </w:tc>
         <w:tc>
           <w:tcPr>
-            <w:tcW w:type="dxa" w:w="393"/>
+            <w:tcW w:type="dxa" w:w="1728"/>
           </w:tcPr>
           <w:p>
             <w:r>
-              <w:t>03/04</w:t>
+              <w:t>03/04/2026</w:t>
             </w:r>
           </w:p>
         </w:tc>
         <w:tc>
           <w:tcPr>
-            <w:tcW w:type="dxa" w:w="393"/>
-          </w:tcPr>
-          <w:p/>
-        </w:tc>
-        <w:tc>
-          <w:tcPr>
-            <w:tcW w:type="dxa" w:w="393"/>
-          </w:tcPr>
-          <w:p/>
-        </w:tc>
-        <w:tc>
-          <w:tcPr>
-            <w:tcW w:type="dxa" w:w="393"/>
-          </w:tcPr>
-          <w:p/>
-        </w:tc>
-        <w:tc>
-          <w:tcPr>
-            <w:tcW w:type="dxa" w:w="393"/>
-          </w:tcPr>
-          <w:p/>
-        </w:tc>
-        <w:tc>
-          <w:tcPr>
-            <w:tcW w:type="dxa" w:w="393"/>
-            <w:shd w:fill="D9E2F3"/>
+            <w:tcW w:type="dxa" w:w="1728"/>
           </w:tcPr>
           <w:p>
-            <w:r/>
+            <w:r>
+              <w:t>Bloque 3.0: LiDAR</w:t>
+            </w:r>
           </w:p>
         </w:tc>
         <w:tc>
           <w:tcPr>
-            <w:tcW w:type="dxa" w:w="393"/>
-            <w:shd w:fill="D9E2F3"/>
+            <w:tcW w:type="dxa" w:w="1728"/>
           </w:tcPr>
           <w:p>
-            <w:r/>
+            <w:r>
+              <w:t>50</w:t>
+            </w:r>
           </w:p>
         </w:tc>
         <w:tc>
           <w:tcPr>
-            <w:tcW w:type="dxa" w:w="393"/>
+            <w:tcW w:type="dxa" w:w="1728"/>
             <w:shd w:fill="D9E2F3"/>
           </w:tcPr>
           <w:p>
-            <w:r/>
-          </w:p>
-        </w:tc>
-        <w:tc>
-          <w:tcPr>
-            <w:tcW w:type="dxa" w:w="393"/>
-            <w:shd w:fill="D9E2F3"/>
-          </w:tcPr>
-          <w:p>
-            <w:r/>
-          </w:p>
-        </w:tc>
-        <w:tc>
-          <w:tcPr>
-            <w:tcW w:type="dxa" w:w="393"/>
-            <w:shd w:fill="D9E2F3"/>
-          </w:tcPr>
-          <w:p>
-            <w:r/>
-          </w:p>
-        </w:tc>
-        <w:tc>
-          <w:tcPr>
-            <w:tcW w:type="dxa" w:w="393"/>
-            <w:shd w:fill="D9E2F3"/>
-          </w:tcPr>
-          <w:p>
-            <w:r/>
-          </w:p>
-        </w:tc>
-        <w:tc>
-          <w:tcPr>
-            <w:tcW w:type="dxa" w:w="393"/>
-            <w:shd w:fill="D9E2F3"/>
-          </w:tcPr>
-          <w:p>
-            <w:r/>
-          </w:p>
-        </w:tc>
-        <w:tc>
-          <w:tcPr>
-            <w:tcW w:type="dxa" w:w="393"/>
-            <w:shd w:fill="D9E2F3"/>
-          </w:tcPr>
-          <w:p>
-            <w:r/>
-          </w:p>
-        </w:tc>
-        <w:tc>
-          <w:tcPr>
-            <w:tcW w:type="dxa" w:w="393"/>
-            <w:shd w:fill="D9E2F3"/>
-          </w:tcPr>
-          <w:p>
-            <w:r/>
-          </w:p>
-        </w:tc>
-        <w:tc>
-          <w:tcPr>
-            <w:tcW w:type="dxa" w:w="393"/>
-            <w:shd w:fill="D9E2F3"/>
-          </w:tcPr>
-          <w:p>
-            <w:r/>
-          </w:p>
-        </w:tc>
-        <w:tc>
-          <w:tcPr>
-            <w:tcW w:type="dxa" w:w="393"/>
-            <w:shd w:fill="D9E2F3"/>
-          </w:tcPr>
-          <w:p>
-            <w:r/>
-          </w:p>
-        </w:tc>
-        <w:tc>
-          <w:tcPr>
-            <w:tcW w:type="dxa" w:w="393"/>
-            <w:shd w:fill="D9E2F3"/>
-          </w:tcPr>
-          <w:p>
-            <w:r/>
-          </w:p>
-        </w:tc>
-        <w:tc>
-          <w:tcPr>
-            <w:tcW w:type="dxa" w:w="393"/>
-            <w:shd w:fill="D9E2F3"/>
-          </w:tcPr>
-          <w:p>
-            <w:r/>
-          </w:p>
-        </w:tc>
-        <w:tc>
-          <w:tcPr>
-            <w:tcW w:type="dxa" w:w="393"/>
-            <w:shd w:fill="D9E2F3"/>
-          </w:tcPr>
-          <w:p>
-            <w:r/>
-          </w:p>
-        </w:tc>
-        <w:tc>
-          <w:tcPr>
-            <w:tcW w:type="dxa" w:w="393"/>
-            <w:shd w:fill="D9E2F3"/>
-          </w:tcPr>
-          <w:p>
-            <w:r/>
-          </w:p>
-        </w:tc>
-        <w:tc>
-          <w:tcPr>
-            <w:tcW w:type="dxa" w:w="393"/>
-            <w:shd w:fill="D9E2F3"/>
-          </w:tcPr>
-          <w:p>
-            <w:r/>
+            <w:r>
+              <w:t>Carro</w:t>
+            </w:r>
           </w:p>
         </w:tc>
       </w:tr>
       <w:tr>
         <w:tc>
           <w:tcPr>
-            <w:tcW w:type="dxa" w:w="393"/>
+            <w:tcW w:type="dxa" w:w="1728"/>
           </w:tcPr>
           <w:p>
             <w:r>
-              <w:t>Bloque 3: Proceso</w:t>
+              <w:t>6</w:t>
             </w:r>
           </w:p>
         </w:tc>
         <w:tc>
           <w:tcPr>
-            <w:tcW w:type="dxa" w:w="393"/>
+            <w:tcW w:type="dxa" w:w="1728"/>
           </w:tcPr>
           <w:p>
             <w:r>
-              <w:t>04/04</w:t>
+              <w:t>04/04/2026</w:t>
             </w:r>
           </w:p>
         </w:tc>
         <w:tc>
           <w:tcPr>
-            <w:tcW w:type="dxa" w:w="393"/>
-          </w:tcPr>
-          <w:p/>
-        </w:tc>
-        <w:tc>
-          <w:tcPr>
-            <w:tcW w:type="dxa" w:w="393"/>
-          </w:tcPr>
-          <w:p/>
-        </w:tc>
-        <w:tc>
-          <w:tcPr>
-            <w:tcW w:type="dxa" w:w="393"/>
-          </w:tcPr>
-          <w:p/>
-        </w:tc>
-        <w:tc>
-          <w:tcPr>
-            <w:tcW w:type="dxa" w:w="393"/>
-          </w:tcPr>
-          <w:p/>
-        </w:tc>
-        <w:tc>
-          <w:tcPr>
-            <w:tcW w:type="dxa" w:w="393"/>
-          </w:tcPr>
-          <w:p/>
-        </w:tc>
-        <w:tc>
-          <w:tcPr>
-            <w:tcW w:type="dxa" w:w="393"/>
-            <w:shd w:fill="E2EFDA"/>
+            <w:tcW w:type="dxa" w:w="1728"/>
           </w:tcPr>
           <w:p>
-            <w:r/>
+            <w:r>
+              <w:t>Bloque 3.0: Proceso</w:t>
+            </w:r>
           </w:p>
         </w:tc>
         <w:tc>
           <w:tcPr>
-            <w:tcW w:type="dxa" w:w="393"/>
-            <w:shd w:fill="E2EFDA"/>
+            <w:tcW w:type="dxa" w:w="1728"/>
           </w:tcPr>
           <w:p>
-            <w:r/>
+            <w:r>
+              <w:t>-</w:t>
+            </w:r>
           </w:p>
         </w:tc>
         <w:tc>
           <w:tcPr>
-            <w:tcW w:type="dxa" w:w="393"/>
+            <w:tcW w:type="dxa" w:w="1728"/>
             <w:shd w:fill="E2EFDA"/>
           </w:tcPr>
           <w:p>
-            <w:r/>
-          </w:p>
-        </w:tc>
-        <w:tc>
-          <w:tcPr>
-            <w:tcW w:type="dxa" w:w="393"/>
-            <w:shd w:fill="E2EFDA"/>
-          </w:tcPr>
-          <w:p>
-            <w:r/>
-          </w:p>
-        </w:tc>
-        <w:tc>
-          <w:tcPr>
-            <w:tcW w:type="dxa" w:w="393"/>
-            <w:shd w:fill="E2EFDA"/>
-          </w:tcPr>
-          <w:p>
-            <w:r/>
-          </w:p>
-        </w:tc>
-        <w:tc>
-          <w:tcPr>
-            <w:tcW w:type="dxa" w:w="393"/>
-            <w:shd w:fill="E2EFDA"/>
-          </w:tcPr>
-          <w:p>
-            <w:r/>
-          </w:p>
-        </w:tc>
-        <w:tc>
-          <w:tcPr>
-            <w:tcW w:type="dxa" w:w="393"/>
-            <w:shd w:fill="E2EFDA"/>
-          </w:tcPr>
-          <w:p>
-            <w:r/>
-          </w:p>
-        </w:tc>
-        <w:tc>
-          <w:tcPr>
-            <w:tcW w:type="dxa" w:w="393"/>
-            <w:shd w:fill="E2EFDA"/>
-          </w:tcPr>
-          <w:p>
-            <w:r/>
-          </w:p>
-        </w:tc>
-        <w:tc>
-          <w:tcPr>
-            <w:tcW w:type="dxa" w:w="393"/>
-            <w:shd w:fill="E2EFDA"/>
-          </w:tcPr>
-          <w:p>
-            <w:r/>
-          </w:p>
-        </w:tc>
-        <w:tc>
-          <w:tcPr>
-            <w:tcW w:type="dxa" w:w="393"/>
-            <w:shd w:fill="E2EFDA"/>
-          </w:tcPr>
-          <w:p>
-            <w:r/>
-          </w:p>
-        </w:tc>
-        <w:tc>
-          <w:tcPr>
-            <w:tcW w:type="dxa" w:w="393"/>
-            <w:shd w:fill="E2EFDA"/>
-          </w:tcPr>
-          <w:p>
-            <w:r/>
-          </w:p>
-        </w:tc>
-        <w:tc>
-          <w:tcPr>
-            <w:tcW w:type="dxa" w:w="393"/>
-            <w:shd w:fill="E2EFDA"/>
-          </w:tcPr>
-          <w:p>
-            <w:r/>
-          </w:p>
-        </w:tc>
-        <w:tc>
-          <w:tcPr>
-            <w:tcW w:type="dxa" w:w="393"/>
-            <w:shd w:fill="E2EFDA"/>
-          </w:tcPr>
-          <w:p>
-            <w:r/>
-          </w:p>
-        </w:tc>
-        <w:tc>
-          <w:tcPr>
-            <w:tcW w:type="dxa" w:w="393"/>
-            <w:shd w:fill="E2EFDA"/>
-          </w:tcPr>
-          <w:p>
-            <w:r/>
-          </w:p>
-        </w:tc>
-        <w:tc>
-          <w:tcPr>
-            <w:tcW w:type="dxa" w:w="393"/>
-            <w:shd w:fill="E2EFDA"/>
-          </w:tcPr>
-          <w:p>
-            <w:r/>
+            <w:r>
+              <w:t>Oficina/Dron</w:t>
+            </w:r>
           </w:p>
         </w:tc>
       </w:tr>
       <w:tr>
         <w:tc>
           <w:tcPr>
-            <w:tcW w:type="dxa" w:w="393"/>
+            <w:tcW w:type="dxa" w:w="1728"/>
           </w:tcPr>
           <w:p>
             <w:r>
-              <w:t>Bloque 4: Vuelo</w:t>
+              <w:t>7</w:t>
             </w:r>
           </w:p>
         </w:tc>
         <w:tc>
           <w:tcPr>
-            <w:tcW w:type="dxa" w:w="393"/>
+            <w:tcW w:type="dxa" w:w="1728"/>
           </w:tcPr>
           <w:p>
             <w:r>
-              <w:t>05/04</w:t>
+              <w:t>05/04/2026</w:t>
             </w:r>
           </w:p>
         </w:tc>
         <w:tc>
           <w:tcPr>
-            <w:tcW w:type="dxa" w:w="393"/>
-          </w:tcPr>
-          <w:p/>
-        </w:tc>
-        <w:tc>
-          <w:tcPr>
-            <w:tcW w:type="dxa" w:w="393"/>
-          </w:tcPr>
-          <w:p/>
-        </w:tc>
-        <w:tc>
-          <w:tcPr>
-            <w:tcW w:type="dxa" w:w="393"/>
-          </w:tcPr>
-          <w:p/>
-        </w:tc>
-        <w:tc>
-          <w:tcPr>
-            <w:tcW w:type="dxa" w:w="393"/>
-          </w:tcPr>
-          <w:p/>
-        </w:tc>
-        <w:tc>
-          <w:tcPr>
-            <w:tcW w:type="dxa" w:w="393"/>
-          </w:tcPr>
-          <w:p/>
-        </w:tc>
-        <w:tc>
-          <w:tcPr>
-            <w:tcW w:type="dxa" w:w="393"/>
-          </w:tcPr>
-          <w:p/>
-        </w:tc>
-        <w:tc>
-          <w:tcPr>
-            <w:tcW w:type="dxa" w:w="393"/>
-            <w:shd w:fill="D9E2F3"/>
+            <w:tcW w:type="dxa" w:w="1728"/>
           </w:tcPr>
           <w:p>
-            <w:r/>
+            <w:r>
+              <w:t>Bloque 4.0: LiDAR</w:t>
+            </w:r>
           </w:p>
         </w:tc>
         <w:tc>
           <w:tcPr>
-            <w:tcW w:type="dxa" w:w="393"/>
-            <w:shd w:fill="D9E2F3"/>
+            <w:tcW w:type="dxa" w:w="1728"/>
           </w:tcPr>
           <w:p>
-            <w:r/>
+            <w:r>
+              <w:t>50</w:t>
+            </w:r>
           </w:p>
         </w:tc>
         <w:tc>
           <w:tcPr>
-            <w:tcW w:type="dxa" w:w="393"/>
+            <w:tcW w:type="dxa" w:w="1728"/>
             <w:shd w:fill="D9E2F3"/>
           </w:tcPr>
           <w:p>
-            <w:r/>
-          </w:p>
-        </w:tc>
-        <w:tc>
-          <w:tcPr>
-            <w:tcW w:type="dxa" w:w="393"/>
-            <w:shd w:fill="D9E2F3"/>
-          </w:tcPr>
-          <w:p>
-            <w:r/>
-          </w:p>
-        </w:tc>
-        <w:tc>
-          <w:tcPr>
-            <w:tcW w:type="dxa" w:w="393"/>
-            <w:shd w:fill="D9E2F3"/>
-          </w:tcPr>
-          <w:p>
-            <w:r/>
-          </w:p>
-        </w:tc>
-        <w:tc>
-          <w:tcPr>
-            <w:tcW w:type="dxa" w:w="393"/>
-            <w:shd w:fill="D9E2F3"/>
-          </w:tcPr>
-          <w:p>
-            <w:r/>
-          </w:p>
-        </w:tc>
-        <w:tc>
-          <w:tcPr>
-            <w:tcW w:type="dxa" w:w="393"/>
-            <w:shd w:fill="D9E2F3"/>
-          </w:tcPr>
-          <w:p>
-            <w:r/>
-          </w:p>
-        </w:tc>
-        <w:tc>
-          <w:tcPr>
-            <w:tcW w:type="dxa" w:w="393"/>
-            <w:shd w:fill="D9E2F3"/>
-          </w:tcPr>
-          <w:p>
-            <w:r/>
-          </w:p>
-        </w:tc>
-        <w:tc>
-          <w:tcPr>
-            <w:tcW w:type="dxa" w:w="393"/>
-            <w:shd w:fill="D9E2F3"/>
-          </w:tcPr>
-          <w:p>
-            <w:r/>
-          </w:p>
-        </w:tc>
-        <w:tc>
-          <w:tcPr>
-            <w:tcW w:type="dxa" w:w="393"/>
-            <w:shd w:fill="D9E2F3"/>
-          </w:tcPr>
-          <w:p>
-            <w:r/>
-          </w:p>
-        </w:tc>
-        <w:tc>
-          <w:tcPr>
-            <w:tcW w:type="dxa" w:w="393"/>
-            <w:shd w:fill="D9E2F3"/>
-          </w:tcPr>
-          <w:p>
-            <w:r/>
-          </w:p>
-        </w:tc>
-        <w:tc>
-          <w:tcPr>
-            <w:tcW w:type="dxa" w:w="393"/>
-            <w:shd w:fill="D9E2F3"/>
-          </w:tcPr>
-          <w:p>
-            <w:r/>
-          </w:p>
-        </w:tc>
-        <w:tc>
-          <w:tcPr>
-            <w:tcW w:type="dxa" w:w="393"/>
-            <w:shd w:fill="D9E2F3"/>
-          </w:tcPr>
-          <w:p>
-            <w:r/>
-          </w:p>
-        </w:tc>
-        <w:tc>
-          <w:tcPr>
-            <w:tcW w:type="dxa" w:w="393"/>
-            <w:shd w:fill="D9E2F3"/>
-          </w:tcPr>
-          <w:p>
-            <w:r/>
+            <w:r>
+              <w:t>Carro</w:t>
+            </w:r>
           </w:p>
         </w:tc>
       </w:tr>
       <w:tr>
         <w:tc>
           <w:tcPr>
-            <w:tcW w:type="dxa" w:w="393"/>
+            <w:tcW w:type="dxa" w:w="1728"/>
           </w:tcPr>
           <w:p>
             <w:r>
-              <w:t>Bloque 4: Proceso</w:t>
+              <w:t>8</w:t>
             </w:r>
           </w:p>
         </w:tc>
         <w:tc>
           <w:tcPr>
-            <w:tcW w:type="dxa" w:w="393"/>
+            <w:tcW w:type="dxa" w:w="1728"/>
           </w:tcPr>
           <w:p>
             <w:r>
-              <w:t>06/04</w:t>
+              <w:t>06/04/2026</w:t>
             </w:r>
           </w:p>
         </w:tc>
         <w:tc>
           <w:tcPr>
-            <w:tcW w:type="dxa" w:w="393"/>
-          </w:tcPr>
-          <w:p/>
-        </w:tc>
-        <w:tc>
-          <w:tcPr>
-            <w:tcW w:type="dxa" w:w="393"/>
-          </w:tcPr>
-          <w:p/>
-        </w:tc>
-        <w:tc>
-          <w:tcPr>
-            <w:tcW w:type="dxa" w:w="393"/>
-          </w:tcPr>
-          <w:p/>
-        </w:tc>
-        <w:tc>
-          <w:tcPr>
-            <w:tcW w:type="dxa" w:w="393"/>
-          </w:tcPr>
-          <w:p/>
-        </w:tc>
-        <w:tc>
-          <w:tcPr>
-            <w:tcW w:type="dxa" w:w="393"/>
-          </w:tcPr>
-          <w:p/>
-        </w:tc>
-        <w:tc>
-          <w:tcPr>
-            <w:tcW w:type="dxa" w:w="393"/>
-          </w:tcPr>
-          <w:p/>
-        </w:tc>
-        <w:tc>
-          <w:tcPr>
-            <w:tcW w:type="dxa" w:w="393"/>
-          </w:tcPr>
-          <w:p/>
-        </w:tc>
-        <w:tc>
-          <w:tcPr>
-            <w:tcW w:type="dxa" w:w="393"/>
-            <w:shd w:fill="E2EFDA"/>
+            <w:tcW w:type="dxa" w:w="1728"/>
           </w:tcPr>
           <w:p>
-            <w:r/>
+            <w:r>
+              <w:t>Bloque 4.0: Proceso</w:t>
+            </w:r>
           </w:p>
         </w:tc>
         <w:tc>
           <w:tcPr>
-            <w:tcW w:type="dxa" w:w="393"/>
-            <w:shd w:fill="E2EFDA"/>
+            <w:tcW w:type="dxa" w:w="1728"/>
           </w:tcPr>
           <w:p>
-            <w:r/>
+            <w:r>
+              <w:t>-</w:t>
+            </w:r>
           </w:p>
         </w:tc>
         <w:tc>
           <w:tcPr>
-            <w:tcW w:type="dxa" w:w="393"/>
+            <w:tcW w:type="dxa" w:w="1728"/>
             <w:shd w:fill="E2EFDA"/>
           </w:tcPr>
           <w:p>
-            <w:r/>
-          </w:p>
-        </w:tc>
-        <w:tc>
-          <w:tcPr>
-            <w:tcW w:type="dxa" w:w="393"/>
-            <w:shd w:fill="E2EFDA"/>
-          </w:tcPr>
-          <w:p>
-            <w:r/>
-          </w:p>
-        </w:tc>
-        <w:tc>
-          <w:tcPr>
-            <w:tcW w:type="dxa" w:w="393"/>
-            <w:shd w:fill="E2EFDA"/>
-          </w:tcPr>
-          <w:p>
-            <w:r/>
-          </w:p>
-        </w:tc>
-        <w:tc>
-          <w:tcPr>
-            <w:tcW w:type="dxa" w:w="393"/>
-            <w:shd w:fill="E2EFDA"/>
-          </w:tcPr>
-          <w:p>
-            <w:r/>
-          </w:p>
-        </w:tc>
-        <w:tc>
-          <w:tcPr>
-            <w:tcW w:type="dxa" w:w="393"/>
-            <w:shd w:fill="E2EFDA"/>
-          </w:tcPr>
-          <w:p>
-            <w:r/>
-          </w:p>
-        </w:tc>
-        <w:tc>
-          <w:tcPr>
-            <w:tcW w:type="dxa" w:w="393"/>
-            <w:shd w:fill="E2EFDA"/>
-          </w:tcPr>
-          <w:p>
-            <w:r/>
-          </w:p>
-        </w:tc>
-        <w:tc>
-          <w:tcPr>
-            <w:tcW w:type="dxa" w:w="393"/>
-            <w:shd w:fill="E2EFDA"/>
-          </w:tcPr>
-          <w:p>
-            <w:r/>
-          </w:p>
-        </w:tc>
-        <w:tc>
-          <w:tcPr>
-            <w:tcW w:type="dxa" w:w="393"/>
-            <w:shd w:fill="E2EFDA"/>
-          </w:tcPr>
-          <w:p>
-            <w:r/>
-          </w:p>
-        </w:tc>
-        <w:tc>
-          <w:tcPr>
-            <w:tcW w:type="dxa" w:w="393"/>
-            <w:shd w:fill="E2EFDA"/>
-          </w:tcPr>
-          <w:p>
-            <w:r/>
-          </w:p>
-        </w:tc>
-        <w:tc>
-          <w:tcPr>
-            <w:tcW w:type="dxa" w:w="393"/>
-            <w:shd w:fill="E2EFDA"/>
-          </w:tcPr>
-          <w:p>
-            <w:r/>
-          </w:p>
-        </w:tc>
-        <w:tc>
-          <w:tcPr>
-            <w:tcW w:type="dxa" w:w="393"/>
-            <w:shd w:fill="E2EFDA"/>
-          </w:tcPr>
-          <w:p>
-            <w:r/>
+            <w:r>
+              <w:t>Oficina/Dron</w:t>
+            </w:r>
           </w:p>
         </w:tc>
       </w:tr>
       <w:tr>
         <w:tc>
           <w:tcPr>
-            <w:tcW w:type="dxa" w:w="393"/>
+            <w:tcW w:type="dxa" w:w="1728"/>
           </w:tcPr>
           <w:p>
             <w:r>
-              <w:t>Bloque 5: Vuelo</w:t>
+              <w:t>9</w:t>
             </w:r>
           </w:p>
         </w:tc>
         <w:tc>
           <w:tcPr>
-            <w:tcW w:type="dxa" w:w="393"/>
+            <w:tcW w:type="dxa" w:w="1728"/>
           </w:tcPr>
           <w:p>
             <w:r>
-              <w:t>07/04</w:t>
+              <w:t>07/04/2026</w:t>
             </w:r>
           </w:p>
         </w:tc>
         <w:tc>
           <w:tcPr>
-            <w:tcW w:type="dxa" w:w="393"/>
-          </w:tcPr>
-          <w:p/>
-        </w:tc>
-        <w:tc>
-          <w:tcPr>
-            <w:tcW w:type="dxa" w:w="393"/>
-          </w:tcPr>
-          <w:p/>
-        </w:tc>
-        <w:tc>
-          <w:tcPr>
-            <w:tcW w:type="dxa" w:w="393"/>
-          </w:tcPr>
-          <w:p/>
-        </w:tc>
-        <w:tc>
-          <w:tcPr>
-            <w:tcW w:type="dxa" w:w="393"/>
-          </w:tcPr>
-          <w:p/>
-        </w:tc>
-        <w:tc>
-          <w:tcPr>
-            <w:tcW w:type="dxa" w:w="393"/>
-          </w:tcPr>
-          <w:p/>
-        </w:tc>
-        <w:tc>
-          <w:tcPr>
-            <w:tcW w:type="dxa" w:w="393"/>
-          </w:tcPr>
-          <w:p/>
-        </w:tc>
-        <w:tc>
-          <w:tcPr>
-            <w:tcW w:type="dxa" w:w="393"/>
-          </w:tcPr>
-          <w:p/>
-        </w:tc>
-        <w:tc>
-          <w:tcPr>
-            <w:tcW w:type="dxa" w:w="393"/>
-          </w:tcPr>
-          <w:p/>
-        </w:tc>
-        <w:tc>
-          <w:tcPr>
-            <w:tcW w:type="dxa" w:w="393"/>
-            <w:shd w:fill="D9E2F3"/>
+            <w:tcW w:type="dxa" w:w="1728"/>
+            <w:shd w:fill="FFF2CC"/>
           </w:tcPr>
           <w:p>
-            <w:r/>
+            <w:r>
+              <w:t>Descanso</w:t>
+            </w:r>
           </w:p>
         </w:tc>
         <w:tc>
           <w:tcPr>
-            <w:tcW w:type="dxa" w:w="393"/>
-            <w:shd w:fill="D9E2F3"/>
+            <w:tcW w:type="dxa" w:w="1728"/>
           </w:tcPr>
           <w:p>
-            <w:r/>
+            <w:r>
+              <w:t>-</w:t>
+            </w:r>
           </w:p>
         </w:tc>
         <w:tc>
           <w:tcPr>
-            <w:tcW w:type="dxa" w:w="393"/>
-            <w:shd w:fill="D9E2F3"/>
+            <w:tcW w:type="dxa" w:w="1728"/>
           </w:tcPr>
           <w:p>
-            <w:r/>
-          </w:p>
-        </w:tc>
-        <w:tc>
-          <w:tcPr>
-            <w:tcW w:type="dxa" w:w="393"/>
-            <w:shd w:fill="D9E2F3"/>
-          </w:tcPr>
-          <w:p>
-            <w:r/>
-          </w:p>
-        </w:tc>
-        <w:tc>
-          <w:tcPr>
-            <w:tcW w:type="dxa" w:w="393"/>
-            <w:shd w:fill="D9E2F3"/>
-          </w:tcPr>
-          <w:p>
-            <w:r/>
-          </w:p>
-        </w:tc>
-        <w:tc>
-          <w:tcPr>
-            <w:tcW w:type="dxa" w:w="393"/>
-            <w:shd w:fill="D9E2F3"/>
-          </w:tcPr>
-          <w:p>
-            <w:r/>
-          </w:p>
-        </w:tc>
-        <w:tc>
-          <w:tcPr>
-            <w:tcW w:type="dxa" w:w="393"/>
-            <w:shd w:fill="D9E2F3"/>
-          </w:tcPr>
-          <w:p>
-            <w:r/>
-          </w:p>
-        </w:tc>
-        <w:tc>
-          <w:tcPr>
-            <w:tcW w:type="dxa" w:w="393"/>
-            <w:shd w:fill="D9E2F3"/>
-          </w:tcPr>
-          <w:p>
-            <w:r/>
-          </w:p>
-        </w:tc>
-        <w:tc>
-          <w:tcPr>
-            <w:tcW w:type="dxa" w:w="393"/>
-            <w:shd w:fill="D9E2F3"/>
-          </w:tcPr>
-          <w:p>
-            <w:r/>
-          </w:p>
-        </w:tc>
-        <w:tc>
-          <w:tcPr>
-            <w:tcW w:type="dxa" w:w="393"/>
-            <w:shd w:fill="D9E2F3"/>
-          </w:tcPr>
-          <w:p>
-            <w:r/>
-          </w:p>
-        </w:tc>
-        <w:tc>
-          <w:tcPr>
-            <w:tcW w:type="dxa" w:w="393"/>
-            <w:shd w:fill="D9E2F3"/>
-          </w:tcPr>
-          <w:p>
-            <w:r/>
-          </w:p>
-        </w:tc>
-        <w:tc>
-          <w:tcPr>
-            <w:tcW w:type="dxa" w:w="393"/>
-            <w:shd w:fill="D9E2F3"/>
-          </w:tcPr>
-          <w:p>
-            <w:r/>
+            <w:r>
+              <w:t>-</w:t>
+            </w:r>
           </w:p>
         </w:tc>
       </w:tr>
       <w:tr>
         <w:tc>
           <w:tcPr>
-            <w:tcW w:type="dxa" w:w="393"/>
+            <w:tcW w:type="dxa" w:w="1728"/>
           </w:tcPr>
           <w:p>
             <w:r>
-              <w:t>Bloque 5: Proceso</w:t>
+              <w:t>10</w:t>
             </w:r>
           </w:p>
         </w:tc>
         <w:tc>
           <w:tcPr>
-            <w:tcW w:type="dxa" w:w="393"/>
+            <w:tcW w:type="dxa" w:w="1728"/>
           </w:tcPr>
           <w:p>
             <w:r>
-              <w:t>08/04</w:t>
+              <w:t>08/04/2026</w:t>
             </w:r>
           </w:p>
         </w:tc>
         <w:tc>
           <w:tcPr>
-            <w:tcW w:type="dxa" w:w="393"/>
-          </w:tcPr>
-          <w:p/>
-        </w:tc>
-        <w:tc>
-          <w:tcPr>
-            <w:tcW w:type="dxa" w:w="393"/>
-          </w:tcPr>
-          <w:p/>
-        </w:tc>
-        <w:tc>
-          <w:tcPr>
-            <w:tcW w:type="dxa" w:w="393"/>
-          </w:tcPr>
-          <w:p/>
-        </w:tc>
-        <w:tc>
-          <w:tcPr>
-            <w:tcW w:type="dxa" w:w="393"/>
-          </w:tcPr>
-          <w:p/>
-        </w:tc>
-        <w:tc>
-          <w:tcPr>
-            <w:tcW w:type="dxa" w:w="393"/>
-          </w:tcPr>
-          <w:p/>
-        </w:tc>
-        <w:tc>
-          <w:tcPr>
-            <w:tcW w:type="dxa" w:w="393"/>
-          </w:tcPr>
-          <w:p/>
-        </w:tc>
-        <w:tc>
-          <w:tcPr>
-            <w:tcW w:type="dxa" w:w="393"/>
-          </w:tcPr>
-          <w:p/>
-        </w:tc>
-        <w:tc>
-          <w:tcPr>
-            <w:tcW w:type="dxa" w:w="393"/>
-          </w:tcPr>
-          <w:p/>
-        </w:tc>
-        <w:tc>
-          <w:tcPr>
-            <w:tcW w:type="dxa" w:w="393"/>
-          </w:tcPr>
-          <w:p/>
-        </w:tc>
-        <w:tc>
-          <w:tcPr>
-            <w:tcW w:type="dxa" w:w="393"/>
-            <w:shd w:fill="E2EFDA"/>
+            <w:tcW w:type="dxa" w:w="1728"/>
           </w:tcPr>
           <w:p>
-            <w:r/>
+            <w:r>
+              <w:t>Bloque 5.0: LiDAR</w:t>
+            </w:r>
           </w:p>
         </w:tc>
         <w:tc>
           <w:tcPr>
-            <w:tcW w:type="dxa" w:w="393"/>
-            <w:shd w:fill="E2EFDA"/>
+            <w:tcW w:type="dxa" w:w="1728"/>
           </w:tcPr>
           <w:p>
-            <w:r/>
+            <w:r>
+              <w:t>50</w:t>
+            </w:r>
           </w:p>
         </w:tc>
         <w:tc>
           <w:tcPr>
-            <w:tcW w:type="dxa" w:w="393"/>
-            <w:shd w:fill="E2EFDA"/>
+            <w:tcW w:type="dxa" w:w="1728"/>
+            <w:shd w:fill="D9E2F3"/>
           </w:tcPr>
           <w:p>
-            <w:r/>
-          </w:p>
-        </w:tc>
-        <w:tc>
-          <w:tcPr>
-            <w:tcW w:type="dxa" w:w="393"/>
-            <w:shd w:fill="E2EFDA"/>
-          </w:tcPr>
-          <w:p>
-            <w:r/>
-          </w:p>
-        </w:tc>
-        <w:tc>
-          <w:tcPr>
-            <w:tcW w:type="dxa" w:w="393"/>
-            <w:shd w:fill="E2EFDA"/>
-          </w:tcPr>
-          <w:p>
-            <w:r/>
-          </w:p>
-        </w:tc>
-        <w:tc>
-          <w:tcPr>
-            <w:tcW w:type="dxa" w:w="393"/>
-            <w:shd w:fill="E2EFDA"/>
-          </w:tcPr>
-          <w:p>
-            <w:r/>
-          </w:p>
-        </w:tc>
-        <w:tc>
-          <w:tcPr>
-            <w:tcW w:type="dxa" w:w="393"/>
-            <w:shd w:fill="E2EFDA"/>
-          </w:tcPr>
-          <w:p>
-            <w:r/>
-          </w:p>
-        </w:tc>
-        <w:tc>
-          <w:tcPr>
-            <w:tcW w:type="dxa" w:w="393"/>
-            <w:shd w:fill="E2EFDA"/>
-          </w:tcPr>
-          <w:p>
-            <w:r/>
-          </w:p>
-        </w:tc>
-        <w:tc>
-          <w:tcPr>
-            <w:tcW w:type="dxa" w:w="393"/>
-            <w:shd w:fill="E2EFDA"/>
-          </w:tcPr>
-          <w:p>
-            <w:r/>
-          </w:p>
-        </w:tc>
-        <w:tc>
-          <w:tcPr>
-            <w:tcW w:type="dxa" w:w="393"/>
-            <w:shd w:fill="E2EFDA"/>
-          </w:tcPr>
-          <w:p>
-            <w:r/>
-          </w:p>
-        </w:tc>
-        <w:tc>
-          <w:tcPr>
-            <w:tcW w:type="dxa" w:w="393"/>
-            <w:shd w:fill="E2EFDA"/>
-          </w:tcPr>
-          <w:p>
-            <w:r/>
+            <w:r>
+              <w:t>Carro</w:t>
+            </w:r>
           </w:p>
         </w:tc>
       </w:tr>
       <w:tr>
         <w:tc>
           <w:tcPr>
-            <w:tcW w:type="dxa" w:w="393"/>
+            <w:tcW w:type="dxa" w:w="1728"/>
           </w:tcPr>
           <w:p>
             <w:r>
-              <w:t>Bloque 6: Vuelo</w:t>
+              <w:t>11</w:t>
             </w:r>
           </w:p>
         </w:tc>
         <w:tc>
           <w:tcPr>
-            <w:tcW w:type="dxa" w:w="393"/>
+            <w:tcW w:type="dxa" w:w="1728"/>
           </w:tcPr>
           <w:p>
             <w:r>
-              <w:t>09/04</w:t>
+              <w:t>09/04/2026</w:t>
             </w:r>
           </w:p>
         </w:tc>
         <w:tc>
           <w:tcPr>
-            <w:tcW w:type="dxa" w:w="393"/>
-          </w:tcPr>
-          <w:p/>
-        </w:tc>
-        <w:tc>
-          <w:tcPr>
-            <w:tcW w:type="dxa" w:w="393"/>
-          </w:tcPr>
-          <w:p/>
-        </w:tc>
-        <w:tc>
-          <w:tcPr>
-            <w:tcW w:type="dxa" w:w="393"/>
-          </w:tcPr>
-          <w:p/>
-        </w:tc>
-        <w:tc>
-          <w:tcPr>
-            <w:tcW w:type="dxa" w:w="393"/>
-          </w:tcPr>
-          <w:p/>
-        </w:tc>
-        <w:tc>
-          <w:tcPr>
-            <w:tcW w:type="dxa" w:w="393"/>
-          </w:tcPr>
-          <w:p/>
-        </w:tc>
-        <w:tc>
-          <w:tcPr>
-            <w:tcW w:type="dxa" w:w="393"/>
-          </w:tcPr>
-          <w:p/>
-        </w:tc>
-        <w:tc>
-          <w:tcPr>
-            <w:tcW w:type="dxa" w:w="393"/>
-          </w:tcPr>
-          <w:p/>
-        </w:tc>
-        <w:tc>
-          <w:tcPr>
-            <w:tcW w:type="dxa" w:w="393"/>
-          </w:tcPr>
-          <w:p/>
-        </w:tc>
-        <w:tc>
-          <w:tcPr>
-            <w:tcW w:type="dxa" w:w="393"/>
-          </w:tcPr>
-          <w:p/>
-        </w:tc>
-        <w:tc>
-          <w:tcPr>
-            <w:tcW w:type="dxa" w:w="393"/>
-          </w:tcPr>
-          <w:p/>
-        </w:tc>
-        <w:tc>
-          <w:tcPr>
-            <w:tcW w:type="dxa" w:w="393"/>
-            <w:shd w:fill="D9E2F3"/>
+            <w:tcW w:type="dxa" w:w="1728"/>
           </w:tcPr>
           <w:p>
-            <w:r/>
+            <w:r>
+              <w:t>Bloque 5.0: Proceso</w:t>
+            </w:r>
           </w:p>
         </w:tc>
         <w:tc>
           <w:tcPr>
-            <w:tcW w:type="dxa" w:w="393"/>
-            <w:shd w:fill="D9E2F3"/>
+            <w:tcW w:type="dxa" w:w="1728"/>
           </w:tcPr>
           <w:p>
-            <w:r/>
+            <w:r>
+              <w:t>-</w:t>
+            </w:r>
           </w:p>
         </w:tc>
         <w:tc>
           <w:tcPr>
-            <w:tcW w:type="dxa" w:w="393"/>
-            <w:shd w:fill="D9E2F3"/>
+            <w:tcW w:type="dxa" w:w="1728"/>
+            <w:shd w:fill="E2EFDA"/>
           </w:tcPr>
           <w:p>
-            <w:r/>
-          </w:p>
-        </w:tc>
-        <w:tc>
-          <w:tcPr>
-            <w:tcW w:type="dxa" w:w="393"/>
-            <w:shd w:fill="D9E2F3"/>
-          </w:tcPr>
-          <w:p>
-            <w:r/>
-          </w:p>
-        </w:tc>
-        <w:tc>
-          <w:tcPr>
-            <w:tcW w:type="dxa" w:w="393"/>
-            <w:shd w:fill="D9E2F3"/>
-          </w:tcPr>
-          <w:p>
-            <w:r/>
-          </w:p>
-        </w:tc>
-        <w:tc>
-          <w:tcPr>
-            <w:tcW w:type="dxa" w:w="393"/>
-            <w:shd w:fill="D9E2F3"/>
-          </w:tcPr>
-          <w:p>
-            <w:r/>
-          </w:p>
-        </w:tc>
-        <w:tc>
-          <w:tcPr>
-            <w:tcW w:type="dxa" w:w="393"/>
-            <w:shd w:fill="D9E2F3"/>
-          </w:tcPr>
-          <w:p>
-            <w:r/>
-          </w:p>
-        </w:tc>
-        <w:tc>
-          <w:tcPr>
-            <w:tcW w:type="dxa" w:w="393"/>
-            <w:shd w:fill="D9E2F3"/>
-          </w:tcPr>
-          <w:p>
-            <w:r/>
-          </w:p>
-        </w:tc>
-        <w:tc>
-          <w:tcPr>
-            <w:tcW w:type="dxa" w:w="393"/>
-            <w:shd w:fill="D9E2F3"/>
-          </w:tcPr>
-          <w:p>
-            <w:r/>
-          </w:p>
-        </w:tc>
-        <w:tc>
-          <w:tcPr>
-            <w:tcW w:type="dxa" w:w="393"/>
-            <w:shd w:fill="D9E2F3"/>
-          </w:tcPr>
-          <w:p>
-            <w:r/>
+            <w:r>
+              <w:t>Oficina/Dron</w:t>
+            </w:r>
           </w:p>
         </w:tc>
       </w:tr>
       <w:tr>
         <w:tc>
           <w:tcPr>
-            <w:tcW w:type="dxa" w:w="393"/>
+            <w:tcW w:type="dxa" w:w="1728"/>
           </w:tcPr>
           <w:p>
             <w:r>
-              <w:t>Bloque 6: Proceso</w:t>
+              <w:t>12</w:t>
             </w:r>
           </w:p>
         </w:tc>
         <w:tc>
           <w:tcPr>
-            <w:tcW w:type="dxa" w:w="393"/>
+            <w:tcW w:type="dxa" w:w="1728"/>
           </w:tcPr>
           <w:p>
             <w:r>
-              <w:t>10/04</w:t>
+              <w:t>10/04/2026</w:t>
             </w:r>
           </w:p>
         </w:tc>
         <w:tc>
           <w:tcPr>
-            <w:tcW w:type="dxa" w:w="393"/>
-          </w:tcPr>
-          <w:p/>
-        </w:tc>
-        <w:tc>
-          <w:tcPr>
-            <w:tcW w:type="dxa" w:w="393"/>
-          </w:tcPr>
-          <w:p/>
-        </w:tc>
-        <w:tc>
-          <w:tcPr>
-            <w:tcW w:type="dxa" w:w="393"/>
-          </w:tcPr>
-          <w:p/>
-        </w:tc>
-        <w:tc>
-          <w:tcPr>
-            <w:tcW w:type="dxa" w:w="393"/>
-          </w:tcPr>
-          <w:p/>
-        </w:tc>
-        <w:tc>
-          <w:tcPr>
-            <w:tcW w:type="dxa" w:w="393"/>
-          </w:tcPr>
-          <w:p/>
-        </w:tc>
-        <w:tc>
-          <w:tcPr>
-            <w:tcW w:type="dxa" w:w="393"/>
-          </w:tcPr>
-          <w:p/>
-        </w:tc>
-        <w:tc>
-          <w:tcPr>
-            <w:tcW w:type="dxa" w:w="393"/>
-          </w:tcPr>
-          <w:p/>
-        </w:tc>
-        <w:tc>
-          <w:tcPr>
-            <w:tcW w:type="dxa" w:w="393"/>
-          </w:tcPr>
-          <w:p/>
-        </w:tc>
-        <w:tc>
-          <w:tcPr>
-            <w:tcW w:type="dxa" w:w="393"/>
-          </w:tcPr>
-          <w:p/>
-        </w:tc>
-        <w:tc>
-          <w:tcPr>
-            <w:tcW w:type="dxa" w:w="393"/>
-          </w:tcPr>
-          <w:p/>
-        </w:tc>
-        <w:tc>
-          <w:tcPr>
-            <w:tcW w:type="dxa" w:w="393"/>
-          </w:tcPr>
-          <w:p/>
-        </w:tc>
-        <w:tc>
-          <w:tcPr>
-            <w:tcW w:type="dxa" w:w="393"/>
-            <w:shd w:fill="E2EFDA"/>
+            <w:tcW w:type="dxa" w:w="1728"/>
           </w:tcPr>
           <w:p>
-            <w:r/>
+            <w:r>
+              <w:t>Bloque 6.0: LiDAR</w:t>
+            </w:r>
           </w:p>
         </w:tc>
         <w:tc>
           <w:tcPr>
-            <w:tcW w:type="dxa" w:w="393"/>
-            <w:shd w:fill="E2EFDA"/>
+            <w:tcW w:type="dxa" w:w="1728"/>
           </w:tcPr>
           <w:p>
-            <w:r/>
+            <w:r>
+              <w:t>50</w:t>
+            </w:r>
           </w:p>
         </w:tc>
         <w:tc>
           <w:tcPr>
-            <w:tcW w:type="dxa" w:w="393"/>
-            <w:shd w:fill="E2EFDA"/>
+            <w:tcW w:type="dxa" w:w="1728"/>
+            <w:shd w:fill="D9E2F3"/>
           </w:tcPr>
           <w:p>
-            <w:r/>
-          </w:p>
-        </w:tc>
-        <w:tc>
-          <w:tcPr>
-            <w:tcW w:type="dxa" w:w="393"/>
-            <w:shd w:fill="E2EFDA"/>
-          </w:tcPr>
-          <w:p>
-            <w:r/>
-          </w:p>
-        </w:tc>
-        <w:tc>
-          <w:tcPr>
-            <w:tcW w:type="dxa" w:w="393"/>
-            <w:shd w:fill="E2EFDA"/>
-          </w:tcPr>
-          <w:p>
-            <w:r/>
-          </w:p>
-        </w:tc>
-        <w:tc>
-          <w:tcPr>
-            <w:tcW w:type="dxa" w:w="393"/>
-            <w:shd w:fill="E2EFDA"/>
-          </w:tcPr>
-          <w:p>
-            <w:r/>
-          </w:p>
-        </w:tc>
-        <w:tc>
-          <w:tcPr>
-            <w:tcW w:type="dxa" w:w="393"/>
-            <w:shd w:fill="E2EFDA"/>
-          </w:tcPr>
-          <w:p>
-            <w:r/>
-          </w:p>
-        </w:tc>
-        <w:tc>
-          <w:tcPr>
-            <w:tcW w:type="dxa" w:w="393"/>
-            <w:shd w:fill="E2EFDA"/>
-          </w:tcPr>
-          <w:p>
-            <w:r/>
-          </w:p>
-        </w:tc>
-        <w:tc>
-          <w:tcPr>
-            <w:tcW w:type="dxa" w:w="393"/>
-            <w:shd w:fill="E2EFDA"/>
-          </w:tcPr>
-          <w:p>
-            <w:r/>
+            <w:r>
+              <w:t>Carro</w:t>
+            </w:r>
           </w:p>
         </w:tc>
       </w:tr>
       <w:tr>
         <w:tc>
           <w:tcPr>
-            <w:tcW w:type="dxa" w:w="393"/>
+            <w:tcW w:type="dxa" w:w="1728"/>
           </w:tcPr>
           <w:p>
             <w:r>
-              <w:t>Bloque 7: Vuelo</w:t>
+              <w:t>13</w:t>
             </w:r>
           </w:p>
         </w:tc>
         <w:tc>
           <w:tcPr>
-            <w:tcW w:type="dxa" w:w="393"/>
+            <w:tcW w:type="dxa" w:w="1728"/>
           </w:tcPr>
           <w:p>
             <w:r>
-              <w:t>11/04</w:t>
+              <w:t>11/04/2026</w:t>
             </w:r>
           </w:p>
         </w:tc>
         <w:tc>
           <w:tcPr>
-            <w:tcW w:type="dxa" w:w="393"/>
-          </w:tcPr>
-          <w:p/>
-        </w:tc>
-        <w:tc>
-          <w:tcPr>
-            <w:tcW w:type="dxa" w:w="393"/>
-          </w:tcPr>
-          <w:p/>
-        </w:tc>
-        <w:tc>
-          <w:tcPr>
-            <w:tcW w:type="dxa" w:w="393"/>
-          </w:tcPr>
-          <w:p/>
-        </w:tc>
-        <w:tc>
-          <w:tcPr>
-            <w:tcW w:type="dxa" w:w="393"/>
-          </w:tcPr>
-          <w:p/>
-        </w:tc>
-        <w:tc>
-          <w:tcPr>
-            <w:tcW w:type="dxa" w:w="393"/>
-          </w:tcPr>
-          <w:p/>
-        </w:tc>
-        <w:tc>
-          <w:tcPr>
-            <w:tcW w:type="dxa" w:w="393"/>
-          </w:tcPr>
-          <w:p/>
-        </w:tc>
-        <w:tc>
-          <w:tcPr>
-            <w:tcW w:type="dxa" w:w="393"/>
-          </w:tcPr>
-          <w:p/>
-        </w:tc>
-        <w:tc>
-          <w:tcPr>
-            <w:tcW w:type="dxa" w:w="393"/>
-          </w:tcPr>
-          <w:p/>
-        </w:tc>
-        <w:tc>
-          <w:tcPr>
-            <w:tcW w:type="dxa" w:w="393"/>
-          </w:tcPr>
-          <w:p/>
-        </w:tc>
-        <w:tc>
-          <w:tcPr>
-            <w:tcW w:type="dxa" w:w="393"/>
-          </w:tcPr>
-          <w:p/>
-        </w:tc>
-        <w:tc>
-          <w:tcPr>
-            <w:tcW w:type="dxa" w:w="393"/>
-          </w:tcPr>
-          <w:p/>
-        </w:tc>
-        <w:tc>
-          <w:tcPr>
-            <w:tcW w:type="dxa" w:w="393"/>
-          </w:tcPr>
-          <w:p/>
-        </w:tc>
-        <w:tc>
-          <w:tcPr>
-            <w:tcW w:type="dxa" w:w="393"/>
-            <w:shd w:fill="D9E2F3"/>
+            <w:tcW w:type="dxa" w:w="1728"/>
           </w:tcPr>
           <w:p>
-            <w:r/>
+            <w:r>
+              <w:t>Bloque 6.0: Proceso</w:t>
+            </w:r>
           </w:p>
         </w:tc>
         <w:tc>
           <w:tcPr>
-            <w:tcW w:type="dxa" w:w="393"/>
-            <w:shd w:fill="D9E2F3"/>
+            <w:tcW w:type="dxa" w:w="1728"/>
           </w:tcPr>
           <w:p>
-            <w:r/>
+            <w:r>
+              <w:t>-</w:t>
+            </w:r>
           </w:p>
         </w:tc>
         <w:tc>
           <w:tcPr>
-            <w:tcW w:type="dxa" w:w="393"/>
-            <w:shd w:fill="D9E2F3"/>
+            <w:tcW w:type="dxa" w:w="1728"/>
+            <w:shd w:fill="E2EFDA"/>
           </w:tcPr>
           <w:p>
-            <w:r/>
-          </w:p>
-        </w:tc>
-        <w:tc>
-          <w:tcPr>
-            <w:tcW w:type="dxa" w:w="393"/>
-            <w:shd w:fill="D9E2F3"/>
-          </w:tcPr>
-          <w:p>
-            <w:r/>
-          </w:p>
-        </w:tc>
-        <w:tc>
-          <w:tcPr>
-            <w:tcW w:type="dxa" w:w="393"/>
-            <w:shd w:fill="D9E2F3"/>
-          </w:tcPr>
-          <w:p>
-            <w:r/>
-          </w:p>
-        </w:tc>
-        <w:tc>
-          <w:tcPr>
-            <w:tcW w:type="dxa" w:w="393"/>
-            <w:shd w:fill="D9E2F3"/>
-          </w:tcPr>
-          <w:p>
-            <w:r/>
-          </w:p>
-        </w:tc>
-        <w:tc>
-          <w:tcPr>
-            <w:tcW w:type="dxa" w:w="393"/>
-            <w:shd w:fill="D9E2F3"/>
-          </w:tcPr>
-          <w:p>
-            <w:r/>
-          </w:p>
-        </w:tc>
-        <w:tc>
-          <w:tcPr>
-            <w:tcW w:type="dxa" w:w="393"/>
-            <w:shd w:fill="D9E2F3"/>
-          </w:tcPr>
-          <w:p>
-            <w:r/>
+            <w:r>
+              <w:t>Oficina/Dron</w:t>
+            </w:r>
           </w:p>
         </w:tc>
       </w:tr>
       <w:tr>
         <w:tc>
           <w:tcPr>
-            <w:tcW w:type="dxa" w:w="393"/>
+            <w:tcW w:type="dxa" w:w="1728"/>
           </w:tcPr>
           <w:p>
             <w:r>
-              <w:t>Bloque 7: Proceso</w:t>
+              <w:t>14</w:t>
             </w:r>
           </w:p>
         </w:tc>
         <w:tc>
           <w:tcPr>
-            <w:tcW w:type="dxa" w:w="393"/>
+            <w:tcW w:type="dxa" w:w="1728"/>
           </w:tcPr>
           <w:p>
             <w:r>
-              <w:t>12/04</w:t>
+              <w:t>12/04/2026</w:t>
             </w:r>
           </w:p>
         </w:tc>
         <w:tc>
           <w:tcPr>
-            <w:tcW w:type="dxa" w:w="393"/>
-          </w:tcPr>
-          <w:p/>
-        </w:tc>
-        <w:tc>
-          <w:tcPr>
-            <w:tcW w:type="dxa" w:w="393"/>
-          </w:tcPr>
-          <w:p/>
-        </w:tc>
-        <w:tc>
-          <w:tcPr>
-            <w:tcW w:type="dxa" w:w="393"/>
-          </w:tcPr>
-          <w:p/>
-        </w:tc>
-        <w:tc>
-          <w:tcPr>
-            <w:tcW w:type="dxa" w:w="393"/>
-          </w:tcPr>
-          <w:p/>
-        </w:tc>
-        <w:tc>
-          <w:tcPr>
-            <w:tcW w:type="dxa" w:w="393"/>
-          </w:tcPr>
-          <w:p/>
-        </w:tc>
-        <w:tc>
-          <w:tcPr>
-            <w:tcW w:type="dxa" w:w="393"/>
-          </w:tcPr>
-          <w:p/>
-        </w:tc>
-        <w:tc>
-          <w:tcPr>
-            <w:tcW w:type="dxa" w:w="393"/>
-          </w:tcPr>
-          <w:p/>
-        </w:tc>
-        <w:tc>
-          <w:tcPr>
-            <w:tcW w:type="dxa" w:w="393"/>
-          </w:tcPr>
-          <w:p/>
-        </w:tc>
-        <w:tc>
-          <w:tcPr>
-            <w:tcW w:type="dxa" w:w="393"/>
-          </w:tcPr>
-          <w:p/>
-        </w:tc>
-        <w:tc>
-          <w:tcPr>
-            <w:tcW w:type="dxa" w:w="393"/>
-          </w:tcPr>
-          <w:p/>
-        </w:tc>
-        <w:tc>
-          <w:tcPr>
-            <w:tcW w:type="dxa" w:w="393"/>
-          </w:tcPr>
-          <w:p/>
-        </w:tc>
-        <w:tc>
-          <w:tcPr>
-            <w:tcW w:type="dxa" w:w="393"/>
-          </w:tcPr>
-          <w:p/>
-        </w:tc>
-        <w:tc>
-          <w:tcPr>
-            <w:tcW w:type="dxa" w:w="393"/>
-          </w:tcPr>
-          <w:p/>
-        </w:tc>
-        <w:tc>
-          <w:tcPr>
-            <w:tcW w:type="dxa" w:w="393"/>
-            <w:shd w:fill="E2EFDA"/>
+            <w:tcW w:type="dxa" w:w="1728"/>
           </w:tcPr>
           <w:p>
-            <w:r/>
+            <w:r>
+              <w:t>Bloque 7.0: LiDAR</w:t>
+            </w:r>
           </w:p>
         </w:tc>
         <w:tc>
           <w:tcPr>
-            <w:tcW w:type="dxa" w:w="393"/>
-            <w:shd w:fill="E2EFDA"/>
+            <w:tcW w:type="dxa" w:w="1728"/>
           </w:tcPr>
           <w:p>
-            <w:r/>
+            <w:r>
+              <w:t>50</w:t>
+            </w:r>
           </w:p>
         </w:tc>
         <w:tc>
           <w:tcPr>
-            <w:tcW w:type="dxa" w:w="393"/>
-            <w:shd w:fill="E2EFDA"/>
+            <w:tcW w:type="dxa" w:w="1728"/>
+            <w:shd w:fill="D9E2F3"/>
           </w:tcPr>
           <w:p>
-            <w:r/>
-          </w:p>
-        </w:tc>
-        <w:tc>
-          <w:tcPr>
-            <w:tcW w:type="dxa" w:w="393"/>
-            <w:shd w:fill="E2EFDA"/>
-          </w:tcPr>
-          <w:p>
-            <w:r/>
-          </w:p>
-        </w:tc>
-        <w:tc>
-          <w:tcPr>
-            <w:tcW w:type="dxa" w:w="393"/>
-            <w:shd w:fill="E2EFDA"/>
-          </w:tcPr>
-          <w:p>
-            <w:r/>
-          </w:p>
-        </w:tc>
-        <w:tc>
-          <w:tcPr>
-            <w:tcW w:type="dxa" w:w="393"/>
-            <w:shd w:fill="E2EFDA"/>
-          </w:tcPr>
-          <w:p>
-            <w:r/>
-          </w:p>
-        </w:tc>
-        <w:tc>
-          <w:tcPr>
-            <w:tcW w:type="dxa" w:w="393"/>
-            <w:shd w:fill="E2EFDA"/>
-          </w:tcPr>
-          <w:p>
-            <w:r/>
+            <w:r>
+              <w:t>Carro</w:t>
+            </w:r>
           </w:p>
         </w:tc>
       </w:tr>
       <w:tr>
         <w:tc>
           <w:tcPr>
-            <w:tcW w:type="dxa" w:w="393"/>
+            <w:tcW w:type="dxa" w:w="1728"/>
           </w:tcPr>
           <w:p>
             <w:r>
-              <w:t>Bloque 8: Vuelo</w:t>
+              <w:t>15</w:t>
             </w:r>
           </w:p>
         </w:tc>
         <w:tc>
           <w:tcPr>
-            <w:tcW w:type="dxa" w:w="393"/>
+            <w:tcW w:type="dxa" w:w="1728"/>
           </w:tcPr>
           <w:p>
             <w:r>
-              <w:t>13/04</w:t>
+              <w:t>13/04/2026</w:t>
             </w:r>
           </w:p>
         </w:tc>
         <w:tc>
           <w:tcPr>
-            <w:tcW w:type="dxa" w:w="393"/>
-          </w:tcPr>
-          <w:p/>
-        </w:tc>
-        <w:tc>
-          <w:tcPr>
-            <w:tcW w:type="dxa" w:w="393"/>
-          </w:tcPr>
-          <w:p/>
-        </w:tc>
-        <w:tc>
-          <w:tcPr>
-            <w:tcW w:type="dxa" w:w="393"/>
-          </w:tcPr>
-          <w:p/>
-        </w:tc>
-        <w:tc>
-          <w:tcPr>
-            <w:tcW w:type="dxa" w:w="393"/>
-          </w:tcPr>
-          <w:p/>
-        </w:tc>
-        <w:tc>
-          <w:tcPr>
-            <w:tcW w:type="dxa" w:w="393"/>
-          </w:tcPr>
-          <w:p/>
-        </w:tc>
-        <w:tc>
-          <w:tcPr>
-            <w:tcW w:type="dxa" w:w="393"/>
-          </w:tcPr>
-          <w:p/>
-        </w:tc>
-        <w:tc>
-          <w:tcPr>
-            <w:tcW w:type="dxa" w:w="393"/>
-          </w:tcPr>
-          <w:p/>
-        </w:tc>
-        <w:tc>
-          <w:tcPr>
-            <w:tcW w:type="dxa" w:w="393"/>
-          </w:tcPr>
-          <w:p/>
-        </w:tc>
-        <w:tc>
-          <w:tcPr>
-            <w:tcW w:type="dxa" w:w="393"/>
-          </w:tcPr>
-          <w:p/>
-        </w:tc>
-        <w:tc>
-          <w:tcPr>
-            <w:tcW w:type="dxa" w:w="393"/>
-          </w:tcPr>
-          <w:p/>
-        </w:tc>
-        <w:tc>
-          <w:tcPr>
-            <w:tcW w:type="dxa" w:w="393"/>
-          </w:tcPr>
-          <w:p/>
-        </w:tc>
-        <w:tc>
-          <w:tcPr>
-            <w:tcW w:type="dxa" w:w="393"/>
-          </w:tcPr>
-          <w:p/>
-        </w:tc>
-        <w:tc>
-          <w:tcPr>
-            <w:tcW w:type="dxa" w:w="393"/>
-          </w:tcPr>
-          <w:p/>
-        </w:tc>
-        <w:tc>
-          <w:tcPr>
-            <w:tcW w:type="dxa" w:w="393"/>
-          </w:tcPr>
-          <w:p/>
-        </w:tc>
-        <w:tc>
-          <w:tcPr>
-            <w:tcW w:type="dxa" w:w="393"/>
-            <w:shd w:fill="D9E2F3"/>
+            <w:tcW w:type="dxa" w:w="1728"/>
           </w:tcPr>
           <w:p>
-            <w:r/>
+            <w:r>
+              <w:t>Bloque 7.0: Proceso</w:t>
+            </w:r>
           </w:p>
         </w:tc>
         <w:tc>
           <w:tcPr>
-            <w:tcW w:type="dxa" w:w="393"/>
-            <w:shd w:fill="D9E2F3"/>
+            <w:tcW w:type="dxa" w:w="1728"/>
           </w:tcPr>
           <w:p>
-            <w:r/>
+            <w:r>
+              <w:t>-</w:t>
+            </w:r>
           </w:p>
         </w:tc>
         <w:tc>
           <w:tcPr>
-            <w:tcW w:type="dxa" w:w="393"/>
-            <w:shd w:fill="D9E2F3"/>
+            <w:tcW w:type="dxa" w:w="1728"/>
+            <w:shd w:fill="E2EFDA"/>
           </w:tcPr>
           <w:p>
-            <w:r/>
-          </w:p>
-        </w:tc>
-        <w:tc>
-          <w:tcPr>
-            <w:tcW w:type="dxa" w:w="393"/>
-            <w:shd w:fill="D9E2F3"/>
-          </w:tcPr>
-          <w:p>
-            <w:r/>
-          </w:p>
-        </w:tc>
-        <w:tc>
-          <w:tcPr>
-            <w:tcW w:type="dxa" w:w="393"/>
-            <w:shd w:fill="D9E2F3"/>
-          </w:tcPr>
-          <w:p>
-            <w:r/>
-          </w:p>
-        </w:tc>
-        <w:tc>
-          <w:tcPr>
-            <w:tcW w:type="dxa" w:w="393"/>
-            <w:shd w:fill="D9E2F3"/>
-          </w:tcPr>
-          <w:p>
-            <w:r/>
+            <w:r>
+              <w:t>Oficina/Dron</w:t>
+            </w:r>
           </w:p>
         </w:tc>
       </w:tr>
       <w:tr>
         <w:tc>
           <w:tcPr>
-            <w:tcW w:type="dxa" w:w="393"/>
+            <w:tcW w:type="dxa" w:w="1728"/>
           </w:tcPr>
           <w:p>
             <w:r>
-              <w:t>Bloque 8: Proceso</w:t>
+              <w:t>16</w:t>
             </w:r>
           </w:p>
         </w:tc>
         <w:tc>
           <w:tcPr>
-            <w:tcW w:type="dxa" w:w="393"/>
+            <w:tcW w:type="dxa" w:w="1728"/>
           </w:tcPr>
           <w:p>
             <w:r>
-              <w:t>14/04</w:t>
+              <w:t>14/04/2026</w:t>
             </w:r>
           </w:p>
         </w:tc>
         <w:tc>
           <w:tcPr>
-            <w:tcW w:type="dxa" w:w="393"/>
-          </w:tcPr>
-          <w:p/>
-        </w:tc>
-        <w:tc>
-          <w:tcPr>
-            <w:tcW w:type="dxa" w:w="393"/>
-          </w:tcPr>
-          <w:p/>
-        </w:tc>
-        <w:tc>
-          <w:tcPr>
-            <w:tcW w:type="dxa" w:w="393"/>
-          </w:tcPr>
-          <w:p/>
-        </w:tc>
-        <w:tc>
-          <w:tcPr>
-            <w:tcW w:type="dxa" w:w="393"/>
-          </w:tcPr>
-          <w:p/>
-        </w:tc>
-        <w:tc>
-          <w:tcPr>
-            <w:tcW w:type="dxa" w:w="393"/>
-          </w:tcPr>
-          <w:p/>
-        </w:tc>
-        <w:tc>
-          <w:tcPr>
-            <w:tcW w:type="dxa" w:w="393"/>
-          </w:tcPr>
-          <w:p/>
-        </w:tc>
-        <w:tc>
-          <w:tcPr>
-            <w:tcW w:type="dxa" w:w="393"/>
-          </w:tcPr>
-          <w:p/>
-        </w:tc>
-        <w:tc>
-          <w:tcPr>
-            <w:tcW w:type="dxa" w:w="393"/>
-          </w:tcPr>
-          <w:p/>
-        </w:tc>
-        <w:tc>
-          <w:tcPr>
-            <w:tcW w:type="dxa" w:w="393"/>
-          </w:tcPr>
-          <w:p/>
-        </w:tc>
-        <w:tc>
-          <w:tcPr>
-            <w:tcW w:type="dxa" w:w="393"/>
-          </w:tcPr>
-          <w:p/>
-        </w:tc>
-        <w:tc>
-          <w:tcPr>
-            <w:tcW w:type="dxa" w:w="393"/>
-          </w:tcPr>
-          <w:p/>
-        </w:tc>
-        <w:tc>
-          <w:tcPr>
-            <w:tcW w:type="dxa" w:w="393"/>
-          </w:tcPr>
-          <w:p/>
-        </w:tc>
-        <w:tc>
-          <w:tcPr>
-            <w:tcW w:type="dxa" w:w="393"/>
-          </w:tcPr>
-          <w:p/>
-        </w:tc>
-        <w:tc>
-          <w:tcPr>
-            <w:tcW w:type="dxa" w:w="393"/>
-          </w:tcPr>
-          <w:p/>
-        </w:tc>
-        <w:tc>
-          <w:tcPr>
-            <w:tcW w:type="dxa" w:w="393"/>
-          </w:tcPr>
-          <w:p/>
-        </w:tc>
-        <w:tc>
-          <w:tcPr>
-            <w:tcW w:type="dxa" w:w="393"/>
-            <w:shd w:fill="E2EFDA"/>
+            <w:tcW w:type="dxa" w:w="1728"/>
           </w:tcPr>
           <w:p>
-            <w:r/>
+            <w:r>
+              <w:t>Bloque 8.0: LiDAR</w:t>
+            </w:r>
           </w:p>
         </w:tc>
         <w:tc>
           <w:tcPr>
-            <w:tcW w:type="dxa" w:w="393"/>
-            <w:shd w:fill="E2EFDA"/>
+            <w:tcW w:type="dxa" w:w="1728"/>
           </w:tcPr>
           <w:p>
-            <w:r/>
+            <w:r>
+              <w:t>50</w:t>
+            </w:r>
           </w:p>
         </w:tc>
         <w:tc>
           <w:tcPr>
-            <w:tcW w:type="dxa" w:w="393"/>
-            <w:shd w:fill="E2EFDA"/>
+            <w:tcW w:type="dxa" w:w="1728"/>
+            <w:shd w:fill="D9E2F3"/>
           </w:tcPr>
           <w:p>
-            <w:r/>
-          </w:p>
-        </w:tc>
-        <w:tc>
-          <w:tcPr>
-            <w:tcW w:type="dxa" w:w="393"/>
-            <w:shd w:fill="E2EFDA"/>
-          </w:tcPr>
-          <w:p>
-            <w:r/>
-          </w:p>
-        </w:tc>
-        <w:tc>
-          <w:tcPr>
-            <w:tcW w:type="dxa" w:w="393"/>
-            <w:shd w:fill="E2EFDA"/>
-          </w:tcPr>
-          <w:p>
-            <w:r/>
+            <w:r>
+              <w:t>Carro</w:t>
+            </w:r>
           </w:p>
         </w:tc>
       </w:tr>
       <w:tr>
         <w:tc>
           <w:tcPr>
-            <w:tcW w:type="dxa" w:w="393"/>
+            <w:tcW w:type="dxa" w:w="1728"/>
           </w:tcPr>
           <w:p>
             <w:r>
-              <w:t>Bloque 9: Vuelo</w:t>
+              <w:t>17</w:t>
             </w:r>
           </w:p>
         </w:tc>
         <w:tc>
           <w:tcPr>
-            <w:tcW w:type="dxa" w:w="393"/>
+            <w:tcW w:type="dxa" w:w="1728"/>
           </w:tcPr>
           <w:p>
             <w:r>
-              <w:t>15/04</w:t>
+              <w:t>15/04/2026</w:t>
             </w:r>
           </w:p>
         </w:tc>
         <w:tc>
           <w:tcPr>
-            <w:tcW w:type="dxa" w:w="393"/>
-          </w:tcPr>
-          <w:p/>
-        </w:tc>
-        <w:tc>
-          <w:tcPr>
-            <w:tcW w:type="dxa" w:w="393"/>
-          </w:tcPr>
-          <w:p/>
-        </w:tc>
-        <w:tc>
-          <w:tcPr>
-            <w:tcW w:type="dxa" w:w="393"/>
-          </w:tcPr>
-          <w:p/>
-        </w:tc>
-        <w:tc>
-          <w:tcPr>
-            <w:tcW w:type="dxa" w:w="393"/>
-          </w:tcPr>
-          <w:p/>
-        </w:tc>
-        <w:tc>
-          <w:tcPr>
-            <w:tcW w:type="dxa" w:w="393"/>
-          </w:tcPr>
-          <w:p/>
-        </w:tc>
-        <w:tc>
-          <w:tcPr>
-            <w:tcW w:type="dxa" w:w="393"/>
-          </w:tcPr>
-          <w:p/>
-        </w:tc>
-        <w:tc>
-          <w:tcPr>
-            <w:tcW w:type="dxa" w:w="393"/>
-          </w:tcPr>
-          <w:p/>
-        </w:tc>
-        <w:tc>
-          <w:tcPr>
-            <w:tcW w:type="dxa" w:w="393"/>
-          </w:tcPr>
-          <w:p/>
-        </w:tc>
-        <w:tc>
-          <w:tcPr>
-            <w:tcW w:type="dxa" w:w="393"/>
-          </w:tcPr>
-          <w:p/>
-        </w:tc>
-        <w:tc>
-          <w:tcPr>
-            <w:tcW w:type="dxa" w:w="393"/>
-          </w:tcPr>
-          <w:p/>
-        </w:tc>
-        <w:tc>
-          <w:tcPr>
-            <w:tcW w:type="dxa" w:w="393"/>
-          </w:tcPr>
-          <w:p/>
-        </w:tc>
-        <w:tc>
-          <w:tcPr>
-            <w:tcW w:type="dxa" w:w="393"/>
-          </w:tcPr>
-          <w:p/>
-        </w:tc>
-        <w:tc>
-          <w:tcPr>
-            <w:tcW w:type="dxa" w:w="393"/>
-          </w:tcPr>
-          <w:p/>
-        </w:tc>
-        <w:tc>
-          <w:tcPr>
-            <w:tcW w:type="dxa" w:w="393"/>
-          </w:tcPr>
-          <w:p/>
-        </w:tc>
-        <w:tc>
-          <w:tcPr>
-            <w:tcW w:type="dxa" w:w="393"/>
-          </w:tcPr>
-          <w:p/>
-        </w:tc>
-        <w:tc>
-          <w:tcPr>
-            <w:tcW w:type="dxa" w:w="393"/>
-          </w:tcPr>
-          <w:p/>
-        </w:tc>
-        <w:tc>
-          <w:tcPr>
-            <w:tcW w:type="dxa" w:w="393"/>
-            <w:shd w:fill="D9E2F3"/>
+            <w:tcW w:type="dxa" w:w="1728"/>
           </w:tcPr>
           <w:p>
-            <w:r/>
+            <w:r>
+              <w:t>Bloque 8.0: Proceso</w:t>
+            </w:r>
           </w:p>
         </w:tc>
         <w:tc>
           <w:tcPr>
-            <w:tcW w:type="dxa" w:w="393"/>
-            <w:shd w:fill="D9E2F3"/>
+            <w:tcW w:type="dxa" w:w="1728"/>
           </w:tcPr>
           <w:p>
-            <w:r/>
+            <w:r>
+              <w:t>-</w:t>
+            </w:r>
           </w:p>
         </w:tc>
         <w:tc>
           <w:tcPr>
-            <w:tcW w:type="dxa" w:w="393"/>
-            <w:shd w:fill="D9E2F3"/>
+            <w:tcW w:type="dxa" w:w="1728"/>
+            <w:shd w:fill="E2EFDA"/>
           </w:tcPr>
           <w:p>
-            <w:r/>
-          </w:p>
-        </w:tc>
-        <w:tc>
-          <w:tcPr>
-            <w:tcW w:type="dxa" w:w="393"/>
-            <w:shd w:fill="D9E2F3"/>
-          </w:tcPr>
-          <w:p>
-            <w:r/>
+            <w:r>
+              <w:t>Oficina/Dron</w:t>
+            </w:r>
           </w:p>
         </w:tc>
       </w:tr>
       <w:tr>
         <w:tc>
           <w:tcPr>
-            <w:tcW w:type="dxa" w:w="393"/>
+            <w:tcW w:type="dxa" w:w="1728"/>
           </w:tcPr>
           <w:p>
             <w:r>
-              <w:t>Bloque 9: Proceso</w:t>
+              <w:t>18</w:t>
             </w:r>
           </w:p>
         </w:tc>
         <w:tc>
           <w:tcPr>
-            <w:tcW w:type="dxa" w:w="393"/>
+            <w:tcW w:type="dxa" w:w="1728"/>
           </w:tcPr>
           <w:p>
             <w:r>
-              <w:t>16/04</w:t>
+              <w:t>16/04/2026</w:t>
             </w:r>
           </w:p>
         </w:tc>
         <w:tc>
           <w:tcPr>
-            <w:tcW w:type="dxa" w:w="393"/>
-          </w:tcPr>
-          <w:p/>
-        </w:tc>
-        <w:tc>
-          <w:tcPr>
-            <w:tcW w:type="dxa" w:w="393"/>
-          </w:tcPr>
-          <w:p/>
-        </w:tc>
-        <w:tc>
-          <w:tcPr>
-            <w:tcW w:type="dxa" w:w="393"/>
-          </w:tcPr>
-          <w:p/>
-        </w:tc>
-        <w:tc>
-          <w:tcPr>
-            <w:tcW w:type="dxa" w:w="393"/>
-          </w:tcPr>
-          <w:p/>
-        </w:tc>
-        <w:tc>
-          <w:tcPr>
-            <w:tcW w:type="dxa" w:w="393"/>
-          </w:tcPr>
-          <w:p/>
-        </w:tc>
-        <w:tc>
-          <w:tcPr>
-            <w:tcW w:type="dxa" w:w="393"/>
-          </w:tcPr>
-          <w:p/>
-        </w:tc>
-        <w:tc>
-          <w:tcPr>
-            <w:tcW w:type="dxa" w:w="393"/>
-          </w:tcPr>
-          <w:p/>
-        </w:tc>
-        <w:tc>
-          <w:tcPr>
-            <w:tcW w:type="dxa" w:w="393"/>
-          </w:tcPr>
-          <w:p/>
-        </w:tc>
-        <w:tc>
-          <w:tcPr>
-            <w:tcW w:type="dxa" w:w="393"/>
-          </w:tcPr>
-          <w:p/>
-        </w:tc>
-        <w:tc>
-          <w:tcPr>
-            <w:tcW w:type="dxa" w:w="393"/>
-          </w:tcPr>
-          <w:p/>
-        </w:tc>
-        <w:tc>
-          <w:tcPr>
-            <w:tcW w:type="dxa" w:w="393"/>
-          </w:tcPr>
-          <w:p/>
-        </w:tc>
-        <w:tc>
-          <w:tcPr>
-            <w:tcW w:type="dxa" w:w="393"/>
-          </w:tcPr>
-          <w:p/>
-        </w:tc>
-        <w:tc>
-          <w:tcPr>
-            <w:tcW w:type="dxa" w:w="393"/>
-          </w:tcPr>
-          <w:p/>
-        </w:tc>
-        <w:tc>
-          <w:tcPr>
-            <w:tcW w:type="dxa" w:w="393"/>
-          </w:tcPr>
-          <w:p/>
-        </w:tc>
-        <w:tc>
-          <w:tcPr>
-            <w:tcW w:type="dxa" w:w="393"/>
-          </w:tcPr>
-          <w:p/>
-        </w:tc>
-        <w:tc>
-          <w:tcPr>
-            <w:tcW w:type="dxa" w:w="393"/>
-          </w:tcPr>
-          <w:p/>
-        </w:tc>
-        <w:tc>
-          <w:tcPr>
-            <w:tcW w:type="dxa" w:w="393"/>
-          </w:tcPr>
-          <w:p/>
-        </w:tc>
-        <w:tc>
-          <w:tcPr>
-            <w:tcW w:type="dxa" w:w="393"/>
-            <w:shd w:fill="E2EFDA"/>
+            <w:tcW w:type="dxa" w:w="1728"/>
+            <w:shd w:fill="FFF2CC"/>
           </w:tcPr>
           <w:p>
-            <w:r/>
+            <w:r>
+              <w:t>Descanso</w:t>
+            </w:r>
           </w:p>
         </w:tc>
         <w:tc>
           <w:tcPr>
-            <w:tcW w:type="dxa" w:w="393"/>
-            <w:shd w:fill="E2EFDA"/>
+            <w:tcW w:type="dxa" w:w="1728"/>
           </w:tcPr>
           <w:p>
-            <w:r/>
+            <w:r>
+              <w:t>-</w:t>
+            </w:r>
           </w:p>
         </w:tc>
         <w:tc>
           <w:tcPr>
-            <w:tcW w:type="dxa" w:w="393"/>
+            <w:tcW w:type="dxa" w:w="1728"/>
+          </w:tcPr>
+          <w:p>
+            <w:r>
+              <w:t>-</w:t>
+            </w:r>
+          </w:p>
+        </w:tc>
+      </w:tr>
+      <w:tr>
+        <w:tc>
+          <w:tcPr>
+            <w:tcW w:type="dxa" w:w="1728"/>
+          </w:tcPr>
+          <w:p>
+            <w:r>
+              <w:t>19</w:t>
+            </w:r>
+          </w:p>
+        </w:tc>
+        <w:tc>
+          <w:tcPr>
+            <w:tcW w:type="dxa" w:w="1728"/>
+          </w:tcPr>
+          <w:p>
+            <w:r>
+              <w:t>17/04/2026</w:t>
+            </w:r>
+          </w:p>
+        </w:tc>
+        <w:tc>
+          <w:tcPr>
+            <w:tcW w:type="dxa" w:w="1728"/>
+          </w:tcPr>
+          <w:p>
+            <w:r>
+              <w:t>Bloque 9.0: LiDAR</w:t>
+            </w:r>
+          </w:p>
+        </w:tc>
+        <w:tc>
+          <w:tcPr>
+            <w:tcW w:type="dxa" w:w="1728"/>
+          </w:tcPr>
+          <w:p>
+            <w:r>
+              <w:t>12</w:t>
+            </w:r>
+          </w:p>
+        </w:tc>
+        <w:tc>
+          <w:tcPr>
+            <w:tcW w:type="dxa" w:w="1728"/>
+            <w:shd w:fill="D9E2F3"/>
+          </w:tcPr>
+          <w:p>
+            <w:r>
+              <w:t>Carro</w:t>
+            </w:r>
+          </w:p>
+        </w:tc>
+      </w:tr>
+      <w:tr>
+        <w:tc>
+          <w:tcPr>
+            <w:tcW w:type="dxa" w:w="1728"/>
+          </w:tcPr>
+          <w:p>
+            <w:r>
+              <w:t>20</w:t>
+            </w:r>
+          </w:p>
+        </w:tc>
+        <w:tc>
+          <w:tcPr>
+            <w:tcW w:type="dxa" w:w="1728"/>
+          </w:tcPr>
+          <w:p>
+            <w:r>
+              <w:t>18/04/2026</w:t>
+            </w:r>
+          </w:p>
+        </w:tc>
+        <w:tc>
+          <w:tcPr>
+            <w:tcW w:type="dxa" w:w="1728"/>
+          </w:tcPr>
+          <w:p>
+            <w:r>
+              <w:t>Bloque 9.0: Proceso</w:t>
+            </w:r>
+          </w:p>
+        </w:tc>
+        <w:tc>
+          <w:tcPr>
+            <w:tcW w:type="dxa" w:w="1728"/>
+          </w:tcPr>
+          <w:p>
+            <w:r>
+              <w:t>-</w:t>
+            </w:r>
+          </w:p>
+        </w:tc>
+        <w:tc>
+          <w:tcPr>
+            <w:tcW w:type="dxa" w:w="1728"/>
             <w:shd w:fill="E2EFDA"/>
           </w:tcPr>
           <w:p>
-            <w:r/>
+            <w:r>
+              <w:t>Oficina/Dron</w:t>
+            </w:r>
           </w:p>
         </w:tc>
       </w:tr>

</xml_diff>